<commit_message>
feat(db): giỏ hàng và dòng đơn trỏ vào Variant, đồng bộ toàn bộ tài liệu
CartItem/OrderItem/Review nay tham chiếu variantId thay vì lưu hai chuỗi
color/size rời rạc; SepayWebhookLog và Notification có FK về Order/Voucher.
Kèm script migrate-variantid.sql chạy lại được nhiều lần để nâng cấp DB có
sẵn mà không mất dữ liệu.

Thêm PUT /admin/vouchers/:id — trước đây giao diện chỉ có route tạo mới nên
nút "Sửa voucher" thực chất tạo thêm một voucher nữa.

Tài liệu sinh lại và đối chiếu từng cột với schema:
- ERD-HoangNha.drawio, hoangnha.dbml sinh lại từ schema.prisma
- HoangNha-BangERD.docx bổ sung variantId/orderId/voucherId và 6 quan hệ mới
- prisma-to-drawio.py, prisma-to-dbml.py: sửa lỗi encoding trên Windows và
  đường dẫn tuyệt đối của máy khác

Co-Authored-By: Claude Opus 5 <noreply@anthropic.com>
</commit_message>
<xml_diff>
--- a/docs/HoangNha-BangERD.docx
+++ b/docs/HoangNha-BangERD.docx
@@ -3378,6 +3378,618 @@
           </w:p>
         </w:tc>
       </w:tr>
+      <w:tr>
+        <w:tc>
+          <w:tcPr>
+            <w:tcW w:type="dxa" w:w="1900"/>
+            <w:tcMar>
+              <w:top w:type="dxa" w:w="60"/>
+              <w:left w:type="dxa" w:w="100"/>
+              <w:bottom w:type="dxa" w:w="60"/>
+              <w:right w:type="dxa" w:w="100"/>
+            </w:tcMar>
+          </w:tcPr>
+          <w:p>
+            <w:pPr>
+              <w:spacing w:after="0" w:before="0"/>
+            </w:pPr>
+            <w:r>
+              <w:rPr>
+                <w:b w:val="false"/>
+                <w:bCs w:val="false"/>
+                <w:sz w:val="18"/>
+                <w:szCs w:val="18"/>
+              </w:rPr>
+              <w:t xml:space="preserve">Variant</w:t>
+            </w:r>
+          </w:p>
+        </w:tc>
+        <w:tc>
+          <w:tcPr>
+            <w:tcW w:type="dxa" w:w="1300"/>
+            <w:tcMar>
+              <w:top w:type="dxa" w:w="60"/>
+              <w:left w:type="dxa" w:w="100"/>
+              <w:bottom w:type="dxa" w:w="60"/>
+              <w:right w:type="dxa" w:w="100"/>
+            </w:tcMar>
+          </w:tcPr>
+          <w:p>
+            <w:pPr>
+              <w:spacing w:after="0" w:before="0"/>
+            </w:pPr>
+            <w:r>
+              <w:rPr>
+                <w:b w:val="false"/>
+                <w:bCs w:val="false"/>
+                <w:sz w:val="18"/>
+                <w:szCs w:val="18"/>
+              </w:rPr>
+              <w:t xml:space="preserve">1 — N</w:t>
+            </w:r>
+          </w:p>
+        </w:tc>
+        <w:tc>
+          <w:tcPr>
+            <w:tcW w:type="dxa" w:w="1900"/>
+            <w:tcMar>
+              <w:top w:type="dxa" w:w="60"/>
+              <w:left w:type="dxa" w:w="100"/>
+              <w:bottom w:type="dxa" w:w="60"/>
+              <w:right w:type="dxa" w:w="100"/>
+            </w:tcMar>
+          </w:tcPr>
+          <w:p>
+            <w:pPr>
+              <w:spacing w:after="0" w:before="0"/>
+            </w:pPr>
+            <w:r>
+              <w:rPr>
+                <w:b w:val="false"/>
+                <w:bCs w:val="false"/>
+                <w:sz w:val="18"/>
+                <w:szCs w:val="18"/>
+              </w:rPr>
+              <w:t xml:space="preserve">CartItem</w:t>
+            </w:r>
+          </w:p>
+        </w:tc>
+        <w:tc>
+          <w:tcPr>
+            <w:tcW w:type="dxa" w:w="3926"/>
+            <w:tcMar>
+              <w:top w:type="dxa" w:w="60"/>
+              <w:left w:type="dxa" w:w="100"/>
+              <w:bottom w:type="dxa" w:w="60"/>
+              <w:right w:type="dxa" w:w="100"/>
+            </w:tcMar>
+          </w:tcPr>
+          <w:p>
+            <w:pPr>
+              <w:spacing w:after="0" w:before="0"/>
+            </w:pPr>
+            <w:r>
+              <w:rPr>
+                <w:b w:val="false"/>
+                <w:bCs w:val="false"/>
+                <w:sz w:val="18"/>
+                <w:szCs w:val="18"/>
+              </w:rPr>
+              <w:t xml:space="preserve">Một biến thể nằm trong nhiều giỏ hàng</w:t>
+            </w:r>
+          </w:p>
+        </w:tc>
+      </w:tr>
+      <w:tr>
+        <w:tc>
+          <w:tcPr>
+            <w:tcW w:type="dxa" w:w="1900"/>
+            <w:tcMar>
+              <w:top w:type="dxa" w:w="60"/>
+              <w:left w:type="dxa" w:w="100"/>
+              <w:bottom w:type="dxa" w:w="60"/>
+              <w:right w:type="dxa" w:w="100"/>
+            </w:tcMar>
+          </w:tcPr>
+          <w:p>
+            <w:pPr>
+              <w:spacing w:after="0" w:before="0"/>
+            </w:pPr>
+            <w:r>
+              <w:rPr>
+                <w:b w:val="false"/>
+                <w:bCs w:val="false"/>
+                <w:sz w:val="18"/>
+                <w:szCs w:val="18"/>
+              </w:rPr>
+              <w:t xml:space="preserve">Variant</w:t>
+            </w:r>
+          </w:p>
+        </w:tc>
+        <w:tc>
+          <w:tcPr>
+            <w:tcW w:type="dxa" w:w="1300"/>
+            <w:tcMar>
+              <w:top w:type="dxa" w:w="60"/>
+              <w:left w:type="dxa" w:w="100"/>
+              <w:bottom w:type="dxa" w:w="60"/>
+              <w:right w:type="dxa" w:w="100"/>
+            </w:tcMar>
+          </w:tcPr>
+          <w:p>
+            <w:pPr>
+              <w:spacing w:after="0" w:before="0"/>
+            </w:pPr>
+            <w:r>
+              <w:rPr>
+                <w:b w:val="false"/>
+                <w:bCs w:val="false"/>
+                <w:sz w:val="18"/>
+                <w:szCs w:val="18"/>
+              </w:rPr>
+              <w:t xml:space="preserve">1 — N</w:t>
+            </w:r>
+          </w:p>
+        </w:tc>
+        <w:tc>
+          <w:tcPr>
+            <w:tcW w:type="dxa" w:w="1900"/>
+            <w:tcMar>
+              <w:top w:type="dxa" w:w="60"/>
+              <w:left w:type="dxa" w:w="100"/>
+              <w:bottom w:type="dxa" w:w="60"/>
+              <w:right w:type="dxa" w:w="100"/>
+            </w:tcMar>
+          </w:tcPr>
+          <w:p>
+            <w:pPr>
+              <w:spacing w:after="0" w:before="0"/>
+            </w:pPr>
+            <w:r>
+              <w:rPr>
+                <w:b w:val="false"/>
+                <w:bCs w:val="false"/>
+                <w:sz w:val="18"/>
+                <w:szCs w:val="18"/>
+              </w:rPr>
+              <w:t xml:space="preserve">OrderItem</w:t>
+            </w:r>
+          </w:p>
+        </w:tc>
+        <w:tc>
+          <w:tcPr>
+            <w:tcW w:type="dxa" w:w="3926"/>
+            <w:tcMar>
+              <w:top w:type="dxa" w:w="60"/>
+              <w:left w:type="dxa" w:w="100"/>
+              <w:bottom w:type="dxa" w:w="60"/>
+              <w:right w:type="dxa" w:w="100"/>
+            </w:tcMar>
+          </w:tcPr>
+          <w:p>
+            <w:pPr>
+              <w:spacing w:after="0" w:before="0"/>
+            </w:pPr>
+            <w:r>
+              <w:rPr>
+                <w:b w:val="false"/>
+                <w:bCs w:val="false"/>
+                <w:sz w:val="18"/>
+                <w:szCs w:val="18"/>
+              </w:rPr>
+              <w:t xml:space="preserve">Một biến thể được bán trong nhiều dòng đơn</w:t>
+            </w:r>
+          </w:p>
+        </w:tc>
+      </w:tr>
+      <w:tr>
+        <w:tc>
+          <w:tcPr>
+            <w:tcW w:type="dxa" w:w="1900"/>
+            <w:tcMar>
+              <w:top w:type="dxa" w:w="60"/>
+              <w:left w:type="dxa" w:w="100"/>
+              <w:bottom w:type="dxa" w:w="60"/>
+              <w:right w:type="dxa" w:w="100"/>
+            </w:tcMar>
+          </w:tcPr>
+          <w:p>
+            <w:pPr>
+              <w:spacing w:after="0" w:before="0"/>
+            </w:pPr>
+            <w:r>
+              <w:rPr>
+                <w:b w:val="false"/>
+                <w:bCs w:val="false"/>
+                <w:sz w:val="18"/>
+                <w:szCs w:val="18"/>
+              </w:rPr>
+              <w:t xml:space="preserve">Variant</w:t>
+            </w:r>
+          </w:p>
+        </w:tc>
+        <w:tc>
+          <w:tcPr>
+            <w:tcW w:type="dxa" w:w="1300"/>
+            <w:tcMar>
+              <w:top w:type="dxa" w:w="60"/>
+              <w:left w:type="dxa" w:w="100"/>
+              <w:bottom w:type="dxa" w:w="60"/>
+              <w:right w:type="dxa" w:w="100"/>
+            </w:tcMar>
+          </w:tcPr>
+          <w:p>
+            <w:pPr>
+              <w:spacing w:after="0" w:before="0"/>
+            </w:pPr>
+            <w:r>
+              <w:rPr>
+                <w:b w:val="false"/>
+                <w:bCs w:val="false"/>
+                <w:sz w:val="18"/>
+                <w:szCs w:val="18"/>
+              </w:rPr>
+              <w:t xml:space="preserve">0..1 — N</w:t>
+            </w:r>
+          </w:p>
+        </w:tc>
+        <w:tc>
+          <w:tcPr>
+            <w:tcW w:type="dxa" w:w="1900"/>
+            <w:tcMar>
+              <w:top w:type="dxa" w:w="60"/>
+              <w:left w:type="dxa" w:w="100"/>
+              <w:bottom w:type="dxa" w:w="60"/>
+              <w:right w:type="dxa" w:w="100"/>
+            </w:tcMar>
+          </w:tcPr>
+          <w:p>
+            <w:pPr>
+              <w:spacing w:after="0" w:before="0"/>
+            </w:pPr>
+            <w:r>
+              <w:rPr>
+                <w:b w:val="false"/>
+                <w:bCs w:val="false"/>
+                <w:sz w:val="18"/>
+                <w:szCs w:val="18"/>
+              </w:rPr>
+              <w:t xml:space="preserve">Review</w:t>
+            </w:r>
+          </w:p>
+        </w:tc>
+        <w:tc>
+          <w:tcPr>
+            <w:tcW w:type="dxa" w:w="3926"/>
+            <w:tcMar>
+              <w:top w:type="dxa" w:w="60"/>
+              <w:left w:type="dxa" w:w="100"/>
+              <w:bottom w:type="dxa" w:w="60"/>
+              <w:right w:type="dxa" w:w="100"/>
+            </w:tcMar>
+          </w:tcPr>
+          <w:p>
+            <w:pPr>
+              <w:spacing w:after="0" w:before="0"/>
+            </w:pPr>
+            <w:r>
+              <w:rPr>
+                <w:b w:val="false"/>
+                <w:bCs w:val="false"/>
+                <w:sz w:val="18"/>
+                <w:szCs w:val="18"/>
+              </w:rPr>
+              <w:t xml:space="preserve">Đánh giá có thể gắn biến thể đã mua (NULL = đánh giá chung)</w:t>
+            </w:r>
+          </w:p>
+        </w:tc>
+      </w:tr>
+      <w:tr>
+        <w:tc>
+          <w:tcPr>
+            <w:tcW w:type="dxa" w:w="1900"/>
+            <w:tcMar>
+              <w:top w:type="dxa" w:w="60"/>
+              <w:left w:type="dxa" w:w="100"/>
+              <w:bottom w:type="dxa" w:w="60"/>
+              <w:right w:type="dxa" w:w="100"/>
+            </w:tcMar>
+          </w:tcPr>
+          <w:p>
+            <w:pPr>
+              <w:spacing w:after="0" w:before="0"/>
+            </w:pPr>
+            <w:r>
+              <w:rPr>
+                <w:b w:val="false"/>
+                <w:bCs w:val="false"/>
+                <w:sz w:val="18"/>
+                <w:szCs w:val="18"/>
+              </w:rPr>
+              <w:t xml:space="preserve">Order</w:t>
+            </w:r>
+          </w:p>
+        </w:tc>
+        <w:tc>
+          <w:tcPr>
+            <w:tcW w:type="dxa" w:w="1300"/>
+            <w:tcMar>
+              <w:top w:type="dxa" w:w="60"/>
+              <w:left w:type="dxa" w:w="100"/>
+              <w:bottom w:type="dxa" w:w="60"/>
+              <w:right w:type="dxa" w:w="100"/>
+            </w:tcMar>
+          </w:tcPr>
+          <w:p>
+            <w:pPr>
+              <w:spacing w:after="0" w:before="0"/>
+            </w:pPr>
+            <w:r>
+              <w:rPr>
+                <w:b w:val="false"/>
+                <w:bCs w:val="false"/>
+                <w:sz w:val="18"/>
+                <w:szCs w:val="18"/>
+              </w:rPr>
+              <w:t xml:space="preserve">0..1 — N</w:t>
+            </w:r>
+          </w:p>
+        </w:tc>
+        <w:tc>
+          <w:tcPr>
+            <w:tcW w:type="dxa" w:w="1900"/>
+            <w:tcMar>
+              <w:top w:type="dxa" w:w="60"/>
+              <w:left w:type="dxa" w:w="100"/>
+              <w:bottom w:type="dxa" w:w="60"/>
+              <w:right w:type="dxa" w:w="100"/>
+            </w:tcMar>
+          </w:tcPr>
+          <w:p>
+            <w:pPr>
+              <w:spacing w:after="0" w:before="0"/>
+            </w:pPr>
+            <w:r>
+              <w:rPr>
+                <w:b w:val="false"/>
+                <w:bCs w:val="false"/>
+                <w:sz w:val="18"/>
+                <w:szCs w:val="18"/>
+              </w:rPr>
+              <w:t xml:space="preserve">SepayWebhookLog</w:t>
+            </w:r>
+          </w:p>
+        </w:tc>
+        <w:tc>
+          <w:tcPr>
+            <w:tcW w:type="dxa" w:w="3926"/>
+            <w:tcMar>
+              <w:top w:type="dxa" w:w="60"/>
+              <w:left w:type="dxa" w:w="100"/>
+              <w:bottom w:type="dxa" w:w="60"/>
+              <w:right w:type="dxa" w:w="100"/>
+            </w:tcMar>
+          </w:tcPr>
+          <w:p>
+            <w:pPr>
+              <w:spacing w:after="0" w:before="0"/>
+            </w:pPr>
+            <w:r>
+              <w:rPr>
+                <w:b w:val="false"/>
+                <w:bCs w:val="false"/>
+                <w:sz w:val="18"/>
+                <w:szCs w:val="18"/>
+              </w:rPr>
+              <w:t xml:space="preserve">Một đơn có thể nhận nhiều webhook đối soát</w:t>
+            </w:r>
+          </w:p>
+        </w:tc>
+      </w:tr>
+      <w:tr>
+        <w:tc>
+          <w:tcPr>
+            <w:tcW w:type="dxa" w:w="1900"/>
+            <w:tcMar>
+              <w:top w:type="dxa" w:w="60"/>
+              <w:left w:type="dxa" w:w="100"/>
+              <w:bottom w:type="dxa" w:w="60"/>
+              <w:right w:type="dxa" w:w="100"/>
+            </w:tcMar>
+          </w:tcPr>
+          <w:p>
+            <w:pPr>
+              <w:spacing w:after="0" w:before="0"/>
+            </w:pPr>
+            <w:r>
+              <w:rPr>
+                <w:b w:val="false"/>
+                <w:bCs w:val="false"/>
+                <w:sz w:val="18"/>
+                <w:szCs w:val="18"/>
+              </w:rPr>
+              <w:t xml:space="preserve">Order</w:t>
+            </w:r>
+          </w:p>
+        </w:tc>
+        <w:tc>
+          <w:tcPr>
+            <w:tcW w:type="dxa" w:w="1300"/>
+            <w:tcMar>
+              <w:top w:type="dxa" w:w="60"/>
+              <w:left w:type="dxa" w:w="100"/>
+              <w:bottom w:type="dxa" w:w="60"/>
+              <w:right w:type="dxa" w:w="100"/>
+            </w:tcMar>
+          </w:tcPr>
+          <w:p>
+            <w:pPr>
+              <w:spacing w:after="0" w:before="0"/>
+            </w:pPr>
+            <w:r>
+              <w:rPr>
+                <w:b w:val="false"/>
+                <w:bCs w:val="false"/>
+                <w:sz w:val="18"/>
+                <w:szCs w:val="18"/>
+              </w:rPr>
+              <w:t xml:space="preserve">0..1 — N</w:t>
+            </w:r>
+          </w:p>
+        </w:tc>
+        <w:tc>
+          <w:tcPr>
+            <w:tcW w:type="dxa" w:w="1900"/>
+            <w:tcMar>
+              <w:top w:type="dxa" w:w="60"/>
+              <w:left w:type="dxa" w:w="100"/>
+              <w:bottom w:type="dxa" w:w="60"/>
+              <w:right w:type="dxa" w:w="100"/>
+            </w:tcMar>
+          </w:tcPr>
+          <w:p>
+            <w:pPr>
+              <w:spacing w:after="0" w:before="0"/>
+            </w:pPr>
+            <w:r>
+              <w:rPr>
+                <w:b w:val="false"/>
+                <w:bCs w:val="false"/>
+                <w:sz w:val="18"/>
+                <w:szCs w:val="18"/>
+              </w:rPr>
+              <w:t xml:space="preserve">Notification</w:t>
+            </w:r>
+          </w:p>
+        </w:tc>
+        <w:tc>
+          <w:tcPr>
+            <w:tcW w:type="dxa" w:w="3926"/>
+            <w:tcMar>
+              <w:top w:type="dxa" w:w="60"/>
+              <w:left w:type="dxa" w:w="100"/>
+              <w:bottom w:type="dxa" w:w="60"/>
+              <w:right w:type="dxa" w:w="100"/>
+            </w:tcMar>
+          </w:tcPr>
+          <w:p>
+            <w:pPr>
+              <w:spacing w:after="0" w:before="0"/>
+            </w:pPr>
+            <w:r>
+              <w:rPr>
+                <w:b w:val="false"/>
+                <w:bCs w:val="false"/>
+                <w:sz w:val="18"/>
+                <w:szCs w:val="18"/>
+              </w:rPr>
+              <w:t xml:space="preserve">Một đơn sinh nhiều thông báo cho khách</w:t>
+            </w:r>
+          </w:p>
+        </w:tc>
+      </w:tr>
+      <w:tr>
+        <w:tc>
+          <w:tcPr>
+            <w:tcW w:type="dxa" w:w="1900"/>
+            <w:tcMar>
+              <w:top w:type="dxa" w:w="60"/>
+              <w:left w:type="dxa" w:w="100"/>
+              <w:bottom w:type="dxa" w:w="60"/>
+              <w:right w:type="dxa" w:w="100"/>
+            </w:tcMar>
+          </w:tcPr>
+          <w:p>
+            <w:pPr>
+              <w:spacing w:after="0" w:before="0"/>
+            </w:pPr>
+            <w:r>
+              <w:rPr>
+                <w:b w:val="false"/>
+                <w:bCs w:val="false"/>
+                <w:sz w:val="18"/>
+                <w:szCs w:val="18"/>
+              </w:rPr>
+              <w:t xml:space="preserve">Voucher</w:t>
+            </w:r>
+          </w:p>
+        </w:tc>
+        <w:tc>
+          <w:tcPr>
+            <w:tcW w:type="dxa" w:w="1300"/>
+            <w:tcMar>
+              <w:top w:type="dxa" w:w="60"/>
+              <w:left w:type="dxa" w:w="100"/>
+              <w:bottom w:type="dxa" w:w="60"/>
+              <w:right w:type="dxa" w:w="100"/>
+            </w:tcMar>
+          </w:tcPr>
+          <w:p>
+            <w:pPr>
+              <w:spacing w:after="0" w:before="0"/>
+            </w:pPr>
+            <w:r>
+              <w:rPr>
+                <w:b w:val="false"/>
+                <w:bCs w:val="false"/>
+                <w:sz w:val="18"/>
+                <w:szCs w:val="18"/>
+              </w:rPr>
+              <w:t xml:space="preserve">0..1 — N</w:t>
+            </w:r>
+          </w:p>
+        </w:tc>
+        <w:tc>
+          <w:tcPr>
+            <w:tcW w:type="dxa" w:w="1900"/>
+            <w:tcMar>
+              <w:top w:type="dxa" w:w="60"/>
+              <w:left w:type="dxa" w:w="100"/>
+              <w:bottom w:type="dxa" w:w="60"/>
+              <w:right w:type="dxa" w:w="100"/>
+            </w:tcMar>
+          </w:tcPr>
+          <w:p>
+            <w:pPr>
+              <w:spacing w:after="0" w:before="0"/>
+            </w:pPr>
+            <w:r>
+              <w:rPr>
+                <w:b w:val="false"/>
+                <w:bCs w:val="false"/>
+                <w:sz w:val="18"/>
+                <w:szCs w:val="18"/>
+              </w:rPr>
+              <w:t xml:space="preserve">Notification</w:t>
+            </w:r>
+          </w:p>
+        </w:tc>
+        <w:tc>
+          <w:tcPr>
+            <w:tcW w:type="dxa" w:w="3926"/>
+            <w:tcMar>
+              <w:top w:type="dxa" w:w="60"/>
+              <w:left w:type="dxa" w:w="100"/>
+              <w:bottom w:type="dxa" w:w="60"/>
+              <w:right w:type="dxa" w:w="100"/>
+            </w:tcMar>
+          </w:tcPr>
+          <w:p>
+            <w:pPr>
+              <w:spacing w:after="0" w:before="0"/>
+            </w:pPr>
+            <w:r>
+              <w:rPr>
+                <w:b w:val="false"/>
+                <w:bCs w:val="false"/>
+                <w:sz w:val="18"/>
+                <w:szCs w:val="18"/>
+              </w:rPr>
+              <w:t xml:space="preserve">Một mã giảm giá được quảng bá qua nhiều thông báo</w:t>
+            </w:r>
+          </w:p>
+        </w:tc>
+      </w:tr>
     </w:tbl>
     <w:p>
       <w:pPr>
@@ -10124,7 +10736,7 @@
           <w:sz w:val="20"/>
           <w:szCs w:val="20"/>
         </w:rPr>
-        <w:t xml:space="preserve">Giỏ hàng lưu ở server nên đồng bộ giữa các thiết bị. UNIQUE(userId, productId, color, size) khiến thêm lại đúng biến thể chỉ cộng dồn quantity thay vì tạo dòng mới.</w:t>
+        <w:t xml:space="preserve">Giỏ hàng lưu ở server nên đồng bộ giữa các thiết bị. UNIQUE(userId, variantId) khiến thêm lại đúng biến thể chỉ cộng dồn quantity thay vì tạo dòng mới. Dòng giỏ trỏ thẳng vào Variant thay vì lưu hai chuỗi color/size rời rạc: chuỗi có thể sai chính tả hoặc trỏ tới biến thể không còn tồn tại, còn variantId thì kiểm tồn kho và giá chỉ là một phép JOIN.</w:t>
       </w:r>
     </w:p>
     <w:tbl>
@@ -10373,7 +10985,6 @@
         <w:tc>
           <w:tcPr>
             <w:tcW w:type="dxa" w:w="1980"/>
-            <w:shd w:fill="F1F5F9" w:color="auto" w:val="clear"/>
             <w:tcMar>
               <w:top w:type="dxa" w:w="60"/>
               <w:left w:type="dxa" w:w="100"/>
@@ -10400,7 +11011,6 @@
         <w:tc>
           <w:tcPr>
             <w:tcW w:type="dxa" w:w="1420"/>
-            <w:shd w:fill="F1F5F9" w:color="auto" w:val="clear"/>
             <w:tcMar>
               <w:top w:type="dxa" w:w="60"/>
               <w:left w:type="dxa" w:w="100"/>
@@ -10427,7 +11037,6 @@
         <w:tc>
           <w:tcPr>
             <w:tcW w:type="dxa" w:w="2200"/>
-            <w:shd w:fill="F1F5F9" w:color="auto" w:val="clear"/>
             <w:tcMar>
               <w:top w:type="dxa" w:w="60"/>
               <w:left w:type="dxa" w:w="100"/>
@@ -10447,14 +11056,13 @@
                 <w:sz w:val="17"/>
                 <w:szCs w:val="17"/>
               </w:rPr>
-              <w:t xml:space="preserve">FK → User.id, CASCADE, UNIQUE(bộ 4)</w:t>
+              <w:t xml:space="preserve">FK → User.id, CASCADE, UNIQUE(bộ 2)</w:t>
             </w:r>
           </w:p>
         </w:tc>
         <w:tc>
           <w:tcPr>
             <w:tcW w:type="dxa" w:w="3426"/>
-            <w:shd w:fill="F1F5F9" w:color="auto" w:val="clear"/>
             <w:tcMar>
               <w:top w:type="dxa" w:w="60"/>
               <w:left w:type="dxa" w:w="100"/>
@@ -10554,7 +11162,7 @@
                 <w:sz w:val="17"/>
                 <w:szCs w:val="17"/>
               </w:rPr>
-              <w:t xml:space="preserve">FK → Product.id, CASCADE, UNIQUE(bộ 4)</w:t>
+              <w:t xml:space="preserve">FK → Product.id, CASCADE</w:t>
             </w:r>
           </w:p>
         </w:tc>
@@ -10580,7 +11188,7 @@
                 <w:sz w:val="18"/>
                 <w:szCs w:val="18"/>
               </w:rPr>
-              <w:t xml:space="preserve">Sản phẩm</w:t>
+              <w:t xml:space="preserve">Sản phẩm (đường tắt, suy ra được từ biến thể)</w:t>
             </w:r>
           </w:p>
         </w:tc>
@@ -10589,7 +11197,6 @@
         <w:tc>
           <w:tcPr>
             <w:tcW w:type="dxa" w:w="1980"/>
-            <w:shd w:fill="F1F5F9" w:color="auto" w:val="clear"/>
             <w:tcMar>
               <w:top w:type="dxa" w:w="60"/>
               <w:left w:type="dxa" w:w="100"/>
@@ -10609,41 +11216,39 @@
                 <w:sz w:val="18"/>
                 <w:szCs w:val="18"/>
               </w:rPr>
-              <w:t xml:space="preserve">color</w:t>
+              <w:t xml:space="preserve">variantId</w:t>
             </w:r>
           </w:p>
         </w:tc>
         <w:tc>
           <w:tcPr>
             <w:tcW w:type="dxa" w:w="1420"/>
-            <w:shd w:fill="F1F5F9" w:color="auto" w:val="clear"/>
-            <w:tcMar>
-              <w:top w:type="dxa" w:w="60"/>
-              <w:left w:type="dxa" w:w="100"/>
-              <w:bottom w:type="dxa" w:w="60"/>
-              <w:right w:type="dxa" w:w="100"/>
-            </w:tcMar>
-          </w:tcPr>
-          <w:p>
-            <w:pPr>
-              <w:spacing w:after="0" w:before="0"/>
-            </w:pPr>
-            <w:r>
-              <w:rPr>
-                <w:rFonts w:ascii="Calibri" w:cs="Calibri" w:eastAsia="Calibri" w:hAnsi="Calibri"/>
-                <w:b w:val="false"/>
-                <w:bCs w:val="false"/>
-                <w:sz w:val="18"/>
-                <w:szCs w:val="18"/>
-              </w:rPr>
-              <w:t xml:space="preserve">VARCHAR(191)</w:t>
+            <w:tcMar>
+              <w:top w:type="dxa" w:w="60"/>
+              <w:left w:type="dxa" w:w="100"/>
+              <w:bottom w:type="dxa" w:w="60"/>
+              <w:right w:type="dxa" w:w="100"/>
+            </w:tcMar>
+          </w:tcPr>
+          <w:p>
+            <w:pPr>
+              <w:spacing w:after="0" w:before="0"/>
+            </w:pPr>
+            <w:r>
+              <w:rPr>
+                <w:rFonts w:ascii="Calibri" w:cs="Calibri" w:eastAsia="Calibri" w:hAnsi="Calibri"/>
+                <w:b w:val="false"/>
+                <w:bCs w:val="false"/>
+                <w:sz w:val="18"/>
+                <w:szCs w:val="18"/>
+              </w:rPr>
+              <w:t xml:space="preserve">INT</w:t>
             </w:r>
           </w:p>
         </w:tc>
         <w:tc>
           <w:tcPr>
             <w:tcW w:type="dxa" w:w="2200"/>
-            <w:shd w:fill="F1F5F9" w:color="auto" w:val="clear"/>
             <w:tcMar>
               <w:top w:type="dxa" w:w="60"/>
               <w:left w:type="dxa" w:w="100"/>
@@ -10663,34 +11268,33 @@
                 <w:sz w:val="17"/>
                 <w:szCs w:val="17"/>
               </w:rPr>
-              <w:t xml:space="preserve">NOT NULL, UNIQUE(bộ 4)</w:t>
+              <w:t xml:space="preserve">FK → Variant.id, CASCADE, UNIQUE(bộ 2)</w:t>
             </w:r>
           </w:p>
         </w:tc>
         <w:tc>
           <w:tcPr>
             <w:tcW w:type="dxa" w:w="3426"/>
-            <w:shd w:fill="F1F5F9" w:color="auto" w:val="clear"/>
-            <w:tcMar>
-              <w:top w:type="dxa" w:w="60"/>
-              <w:left w:type="dxa" w:w="100"/>
-              <w:bottom w:type="dxa" w:w="60"/>
-              <w:right w:type="dxa" w:w="100"/>
-            </w:tcMar>
-          </w:tcPr>
-          <w:p>
-            <w:pPr>
-              <w:spacing w:after="0" w:before="0"/>
-            </w:pPr>
-            <w:r>
-              <w:rPr>
-                <w:rFonts w:ascii="Calibri" w:cs="Calibri" w:eastAsia="Calibri" w:hAnsi="Calibri"/>
-                <w:b w:val="false"/>
-                <w:bCs w:val="false"/>
-                <w:sz w:val="18"/>
-                <w:szCs w:val="18"/>
-              </w:rPr>
-              <w:t xml:space="preserve">Màu đã chọn</w:t>
+            <w:tcMar>
+              <w:top w:type="dxa" w:w="60"/>
+              <w:left w:type="dxa" w:w="100"/>
+              <w:bottom w:type="dxa" w:w="60"/>
+              <w:right w:type="dxa" w:w="100"/>
+            </w:tcMar>
+          </w:tcPr>
+          <w:p>
+            <w:pPr>
+              <w:spacing w:after="0" w:before="0"/>
+            </w:pPr>
+            <w:r>
+              <w:rPr>
+                <w:rFonts w:ascii="Calibri" w:cs="Calibri" w:eastAsia="Calibri" w:hAnsi="Calibri"/>
+                <w:b w:val="false"/>
+                <w:bCs w:val="false"/>
+                <w:sz w:val="18"/>
+                <w:szCs w:val="18"/>
+              </w:rPr>
+              <w:t xml:space="preserve">Biến thể màu × size đã chọn — thay cho 2 cột chuỗi color/size cũ</w:t>
             </w:r>
           </w:p>
         </w:tc>
@@ -10699,6 +11303,7 @@
         <w:tc>
           <w:tcPr>
             <w:tcW w:type="dxa" w:w="1980"/>
+            <w:shd w:fill="FFFFFF" w:color="auto" w:val="clear"/>
             <w:tcMar>
               <w:top w:type="dxa" w:w="60"/>
               <w:left w:type="dxa" w:w="100"/>
@@ -10718,39 +11323,41 @@
                 <w:sz w:val="18"/>
                 <w:szCs w:val="18"/>
               </w:rPr>
-              <w:t xml:space="preserve">size</w:t>
+              <w:t xml:space="preserve">quantity</w:t>
             </w:r>
           </w:p>
         </w:tc>
         <w:tc>
           <w:tcPr>
             <w:tcW w:type="dxa" w:w="1420"/>
-            <w:tcMar>
-              <w:top w:type="dxa" w:w="60"/>
-              <w:left w:type="dxa" w:w="100"/>
-              <w:bottom w:type="dxa" w:w="60"/>
-              <w:right w:type="dxa" w:w="100"/>
-            </w:tcMar>
-          </w:tcPr>
-          <w:p>
-            <w:pPr>
-              <w:spacing w:after="0" w:before="0"/>
-            </w:pPr>
-            <w:r>
-              <w:rPr>
-                <w:rFonts w:ascii="Calibri" w:cs="Calibri" w:eastAsia="Calibri" w:hAnsi="Calibri"/>
-                <w:b w:val="false"/>
-                <w:bCs w:val="false"/>
-                <w:sz w:val="18"/>
-                <w:szCs w:val="18"/>
-              </w:rPr>
-              <w:t xml:space="preserve">VARCHAR(191)</w:t>
+            <w:shd w:fill="FFFFFF" w:color="auto" w:val="clear"/>
+            <w:tcMar>
+              <w:top w:type="dxa" w:w="60"/>
+              <w:left w:type="dxa" w:w="100"/>
+              <w:bottom w:type="dxa" w:w="60"/>
+              <w:right w:type="dxa" w:w="100"/>
+            </w:tcMar>
+          </w:tcPr>
+          <w:p>
+            <w:pPr>
+              <w:spacing w:after="0" w:before="0"/>
+            </w:pPr>
+            <w:r>
+              <w:rPr>
+                <w:rFonts w:ascii="Calibri" w:cs="Calibri" w:eastAsia="Calibri" w:hAnsi="Calibri"/>
+                <w:b w:val="false"/>
+                <w:bCs w:val="false"/>
+                <w:sz w:val="18"/>
+                <w:szCs w:val="18"/>
+              </w:rPr>
+              <w:t xml:space="preserve">INT</w:t>
             </w:r>
           </w:p>
         </w:tc>
         <w:tc>
           <w:tcPr>
             <w:tcW w:type="dxa" w:w="2200"/>
+            <w:shd w:fill="FFFFFF" w:color="auto" w:val="clear"/>
             <w:tcMar>
               <w:top w:type="dxa" w:w="60"/>
               <w:left w:type="dxa" w:w="100"/>
@@ -10770,123 +11377,14 @@
                 <w:sz w:val="17"/>
                 <w:szCs w:val="17"/>
               </w:rPr>
-              <w:t xml:space="preserve">NOT NULL, UNIQUE(bộ 4)</w:t>
+              <w:t xml:space="preserve">NOT NULL, DEFAULT 1</w:t>
             </w:r>
           </w:p>
         </w:tc>
         <w:tc>
           <w:tcPr>
             <w:tcW w:type="dxa" w:w="3426"/>
-            <w:tcMar>
-              <w:top w:type="dxa" w:w="60"/>
-              <w:left w:type="dxa" w:w="100"/>
-              <w:bottom w:type="dxa" w:w="60"/>
-              <w:right w:type="dxa" w:w="100"/>
-            </w:tcMar>
-          </w:tcPr>
-          <w:p>
-            <w:pPr>
-              <w:spacing w:after="0" w:before="0"/>
-            </w:pPr>
-            <w:r>
-              <w:rPr>
-                <w:rFonts w:ascii="Calibri" w:cs="Calibri" w:eastAsia="Calibri" w:hAnsi="Calibri"/>
-                <w:b w:val="false"/>
-                <w:bCs w:val="false"/>
-                <w:sz w:val="18"/>
-                <w:szCs w:val="18"/>
-              </w:rPr>
-              <w:t xml:space="preserve">Size đã chọn</w:t>
-            </w:r>
-          </w:p>
-        </w:tc>
-      </w:tr>
-      <w:tr>
-        <w:tc>
-          <w:tcPr>
-            <w:tcW w:type="dxa" w:w="1980"/>
-            <w:shd w:fill="F1F5F9" w:color="auto" w:val="clear"/>
-            <w:tcMar>
-              <w:top w:type="dxa" w:w="60"/>
-              <w:left w:type="dxa" w:w="100"/>
-              <w:bottom w:type="dxa" w:w="60"/>
-              <w:right w:type="dxa" w:w="100"/>
-            </w:tcMar>
-          </w:tcPr>
-          <w:p>
-            <w:pPr>
-              <w:spacing w:after="0" w:before="0"/>
-            </w:pPr>
-            <w:r>
-              <w:rPr>
-                <w:rFonts w:ascii="Consolas" w:cs="Consolas" w:eastAsia="Consolas" w:hAnsi="Consolas"/>
-                <w:b/>
-                <w:bCs/>
-                <w:sz w:val="18"/>
-                <w:szCs w:val="18"/>
-              </w:rPr>
-              <w:t xml:space="preserve">quantity</w:t>
-            </w:r>
-          </w:p>
-        </w:tc>
-        <w:tc>
-          <w:tcPr>
-            <w:tcW w:type="dxa" w:w="1420"/>
-            <w:shd w:fill="F1F5F9" w:color="auto" w:val="clear"/>
-            <w:tcMar>
-              <w:top w:type="dxa" w:w="60"/>
-              <w:left w:type="dxa" w:w="100"/>
-              <w:bottom w:type="dxa" w:w="60"/>
-              <w:right w:type="dxa" w:w="100"/>
-            </w:tcMar>
-          </w:tcPr>
-          <w:p>
-            <w:pPr>
-              <w:spacing w:after="0" w:before="0"/>
-            </w:pPr>
-            <w:r>
-              <w:rPr>
-                <w:rFonts w:ascii="Calibri" w:cs="Calibri" w:eastAsia="Calibri" w:hAnsi="Calibri"/>
-                <w:b w:val="false"/>
-                <w:bCs w:val="false"/>
-                <w:sz w:val="18"/>
-                <w:szCs w:val="18"/>
-              </w:rPr>
-              <w:t xml:space="preserve">INT</w:t>
-            </w:r>
-          </w:p>
-        </w:tc>
-        <w:tc>
-          <w:tcPr>
-            <w:tcW w:type="dxa" w:w="2200"/>
-            <w:shd w:fill="F1F5F9" w:color="auto" w:val="clear"/>
-            <w:tcMar>
-              <w:top w:type="dxa" w:w="60"/>
-              <w:left w:type="dxa" w:w="100"/>
-              <w:bottom w:type="dxa" w:w="60"/>
-              <w:right w:type="dxa" w:w="100"/>
-            </w:tcMar>
-          </w:tcPr>
-          <w:p>
-            <w:pPr>
-              <w:spacing w:after="0" w:before="0"/>
-            </w:pPr>
-            <w:r>
-              <w:rPr>
-                <w:rFonts w:ascii="Calibri" w:cs="Calibri" w:eastAsia="Calibri" w:hAnsi="Calibri"/>
-                <w:b w:val="false"/>
-                <w:bCs w:val="false"/>
-                <w:sz w:val="17"/>
-                <w:szCs w:val="17"/>
-              </w:rPr>
-              <w:t xml:space="preserve">NOT NULL, DEFAULT 1</w:t>
-            </w:r>
-          </w:p>
-        </w:tc>
-        <w:tc>
-          <w:tcPr>
-            <w:tcW w:type="dxa" w:w="3426"/>
-            <w:shd w:fill="F1F5F9" w:color="auto" w:val="clear"/>
+            <w:shd w:fill="FFFFFF" w:color="auto" w:val="clear"/>
             <w:tcMar>
               <w:top w:type="dxa" w:w="60"/>
               <w:left w:type="dxa" w:w="100"/>
@@ -13723,7 +14221,6 @@
         <w:tc>
           <w:tcPr>
             <w:tcW w:type="dxa" w:w="1980"/>
-            <w:shd w:fill="F1F5F9" w:color="auto" w:val="clear"/>
             <w:tcMar>
               <w:top w:type="dxa" w:w="60"/>
               <w:left w:type="dxa" w:w="100"/>
@@ -13743,41 +14240,39 @@
                 <w:sz w:val="18"/>
                 <w:szCs w:val="18"/>
               </w:rPr>
-              <w:t xml:space="preserve">name</w:t>
+              <w:t xml:space="preserve">variantId</w:t>
             </w:r>
           </w:p>
         </w:tc>
         <w:tc>
           <w:tcPr>
             <w:tcW w:type="dxa" w:w="1420"/>
-            <w:shd w:fill="F1F5F9" w:color="auto" w:val="clear"/>
-            <w:tcMar>
-              <w:top w:type="dxa" w:w="60"/>
-              <w:left w:type="dxa" w:w="100"/>
-              <w:bottom w:type="dxa" w:w="60"/>
-              <w:right w:type="dxa" w:w="100"/>
-            </w:tcMar>
-          </w:tcPr>
-          <w:p>
-            <w:pPr>
-              <w:spacing w:after="0" w:before="0"/>
-            </w:pPr>
-            <w:r>
-              <w:rPr>
-                <w:rFonts w:ascii="Calibri" w:cs="Calibri" w:eastAsia="Calibri" w:hAnsi="Calibri"/>
-                <w:b w:val="false"/>
-                <w:bCs w:val="false"/>
-                <w:sz w:val="18"/>
-                <w:szCs w:val="18"/>
-              </w:rPr>
-              <w:t xml:space="preserve">VARCHAR(191)</w:t>
+            <w:tcMar>
+              <w:top w:type="dxa" w:w="60"/>
+              <w:left w:type="dxa" w:w="100"/>
+              <w:bottom w:type="dxa" w:w="60"/>
+              <w:right w:type="dxa" w:w="100"/>
+            </w:tcMar>
+          </w:tcPr>
+          <w:p>
+            <w:pPr>
+              <w:spacing w:after="0" w:before="0"/>
+            </w:pPr>
+            <w:r>
+              <w:rPr>
+                <w:rFonts w:ascii="Calibri" w:cs="Calibri" w:eastAsia="Calibri" w:hAnsi="Calibri"/>
+                <w:b w:val="false"/>
+                <w:bCs w:val="false"/>
+                <w:sz w:val="18"/>
+                <w:szCs w:val="18"/>
+              </w:rPr>
+              <w:t xml:space="preserve">INT</w:t>
             </w:r>
           </w:p>
         </w:tc>
         <w:tc>
           <w:tcPr>
             <w:tcW w:type="dxa" w:w="2200"/>
-            <w:shd w:fill="F1F5F9" w:color="auto" w:val="clear"/>
             <w:tcMar>
               <w:top w:type="dxa" w:w="60"/>
               <w:left w:type="dxa" w:w="100"/>
@@ -13797,34 +14292,33 @@
                 <w:sz w:val="17"/>
                 <w:szCs w:val="17"/>
               </w:rPr>
-              <w:t xml:space="preserve">NOT NULL</w:t>
+              <w:t xml:space="preserve">FK → Variant.id</w:t>
             </w:r>
           </w:p>
         </w:tc>
         <w:tc>
           <w:tcPr>
             <w:tcW w:type="dxa" w:w="3426"/>
-            <w:shd w:fill="F1F5F9" w:color="auto" w:val="clear"/>
-            <w:tcMar>
-              <w:top w:type="dxa" w:w="60"/>
-              <w:left w:type="dxa" w:w="100"/>
-              <w:bottom w:type="dxa" w:w="60"/>
-              <w:right w:type="dxa" w:w="100"/>
-            </w:tcMar>
-          </w:tcPr>
-          <w:p>
-            <w:pPr>
-              <w:spacing w:after="0" w:before="0"/>
-            </w:pPr>
-            <w:r>
-              <w:rPr>
-                <w:rFonts w:ascii="Calibri" w:cs="Calibri" w:eastAsia="Calibri" w:hAnsi="Calibri"/>
-                <w:b w:val="false"/>
-                <w:bCs w:val="false"/>
-                <w:sz w:val="18"/>
-                <w:szCs w:val="18"/>
-              </w:rPr>
-              <w:t xml:space="preserve">Tên sản phẩm lúc mua (snapshot)</w:t>
+            <w:tcMar>
+              <w:top w:type="dxa" w:w="60"/>
+              <w:left w:type="dxa" w:w="100"/>
+              <w:bottom w:type="dxa" w:w="60"/>
+              <w:right w:type="dxa" w:w="100"/>
+            </w:tcMar>
+          </w:tcPr>
+          <w:p>
+            <w:pPr>
+              <w:spacing w:after="0" w:before="0"/>
+            </w:pPr>
+            <w:r>
+              <w:rPr>
+                <w:rFonts w:ascii="Calibri" w:cs="Calibri" w:eastAsia="Calibri" w:hAnsi="Calibri"/>
+                <w:b w:val="false"/>
+                <w:bCs w:val="false"/>
+                <w:sz w:val="18"/>
+                <w:szCs w:val="18"/>
+              </w:rPr>
+              <w:t xml:space="preserve">Biến thể đã bán — dùng để hoàn kho đúng khi hủy đơn</w:t>
             </w:r>
           </w:p>
         </w:tc>
@@ -13833,6 +14327,7 @@
         <w:tc>
           <w:tcPr>
             <w:tcW w:type="dxa" w:w="1980"/>
+            <w:shd w:fill="FFFFFF" w:color="auto" w:val="clear"/>
             <w:tcMar>
               <w:top w:type="dxa" w:w="60"/>
               <w:left w:type="dxa" w:w="100"/>
@@ -13852,39 +14347,41 @@
                 <w:sz w:val="18"/>
                 <w:szCs w:val="18"/>
               </w:rPr>
-              <w:t xml:space="preserve">price</w:t>
+              <w:t xml:space="preserve">name</w:t>
             </w:r>
           </w:p>
         </w:tc>
         <w:tc>
           <w:tcPr>
             <w:tcW w:type="dxa" w:w="1420"/>
-            <w:tcMar>
-              <w:top w:type="dxa" w:w="60"/>
-              <w:left w:type="dxa" w:w="100"/>
-              <w:bottom w:type="dxa" w:w="60"/>
-              <w:right w:type="dxa" w:w="100"/>
-            </w:tcMar>
-          </w:tcPr>
-          <w:p>
-            <w:pPr>
-              <w:spacing w:after="0" w:before="0"/>
-            </w:pPr>
-            <w:r>
-              <w:rPr>
-                <w:rFonts w:ascii="Calibri" w:cs="Calibri" w:eastAsia="Calibri" w:hAnsi="Calibri"/>
-                <w:b w:val="false"/>
-                <w:bCs w:val="false"/>
-                <w:sz w:val="18"/>
-                <w:szCs w:val="18"/>
-              </w:rPr>
-              <w:t xml:space="preserve">INT</w:t>
+            <w:shd w:fill="FFFFFF" w:color="auto" w:val="clear"/>
+            <w:tcMar>
+              <w:top w:type="dxa" w:w="60"/>
+              <w:left w:type="dxa" w:w="100"/>
+              <w:bottom w:type="dxa" w:w="60"/>
+              <w:right w:type="dxa" w:w="100"/>
+            </w:tcMar>
+          </w:tcPr>
+          <w:p>
+            <w:pPr>
+              <w:spacing w:after="0" w:before="0"/>
+            </w:pPr>
+            <w:r>
+              <w:rPr>
+                <w:rFonts w:ascii="Calibri" w:cs="Calibri" w:eastAsia="Calibri" w:hAnsi="Calibri"/>
+                <w:b w:val="false"/>
+                <w:bCs w:val="false"/>
+                <w:sz w:val="18"/>
+                <w:szCs w:val="18"/>
+              </w:rPr>
+              <w:t xml:space="preserve">VARCHAR(191)</w:t>
             </w:r>
           </w:p>
         </w:tc>
         <w:tc>
           <w:tcPr>
             <w:tcW w:type="dxa" w:w="2200"/>
+            <w:shd w:fill="FFFFFF" w:color="auto" w:val="clear"/>
             <w:tcMar>
               <w:top w:type="dxa" w:w="60"/>
               <w:left w:type="dxa" w:w="100"/>
@@ -13911,26 +14408,27 @@
         <w:tc>
           <w:tcPr>
             <w:tcW w:type="dxa" w:w="3426"/>
-            <w:tcMar>
-              <w:top w:type="dxa" w:w="60"/>
-              <w:left w:type="dxa" w:w="100"/>
-              <w:bottom w:type="dxa" w:w="60"/>
-              <w:right w:type="dxa" w:w="100"/>
-            </w:tcMar>
-          </w:tcPr>
-          <w:p>
-            <w:pPr>
-              <w:spacing w:after="0" w:before="0"/>
-            </w:pPr>
-            <w:r>
-              <w:rPr>
-                <w:rFonts w:ascii="Calibri" w:cs="Calibri" w:eastAsia="Calibri" w:hAnsi="Calibri"/>
-                <w:b w:val="false"/>
-                <w:bCs w:val="false"/>
-                <w:sz w:val="18"/>
-                <w:szCs w:val="18"/>
-              </w:rPr>
-              <w:t xml:space="preserve">Đơn giá lúc mua (snapshot)</w:t>
+            <w:shd w:fill="FFFFFF" w:color="auto" w:val="clear"/>
+            <w:tcMar>
+              <w:top w:type="dxa" w:w="60"/>
+              <w:left w:type="dxa" w:w="100"/>
+              <w:bottom w:type="dxa" w:w="60"/>
+              <w:right w:type="dxa" w:w="100"/>
+            </w:tcMar>
+          </w:tcPr>
+          <w:p>
+            <w:pPr>
+              <w:spacing w:after="0" w:before="0"/>
+            </w:pPr>
+            <w:r>
+              <w:rPr>
+                <w:rFonts w:ascii="Calibri" w:cs="Calibri" w:eastAsia="Calibri" w:hAnsi="Calibri"/>
+                <w:b w:val="false"/>
+                <w:bCs w:val="false"/>
+                <w:sz w:val="18"/>
+                <w:szCs w:val="18"/>
+              </w:rPr>
+              <w:t xml:space="preserve">Tên sản phẩm lúc mua (snapshot)</w:t>
             </w:r>
           </w:p>
         </w:tc>
@@ -13939,7 +14437,6 @@
         <w:tc>
           <w:tcPr>
             <w:tcW w:type="dxa" w:w="1980"/>
-            <w:shd w:fill="F1F5F9" w:color="auto" w:val="clear"/>
             <w:tcMar>
               <w:top w:type="dxa" w:w="60"/>
               <w:left w:type="dxa" w:w="100"/>
@@ -13959,14 +14456,13 @@
                 <w:sz w:val="18"/>
                 <w:szCs w:val="18"/>
               </w:rPr>
-              <w:t xml:space="preserve">quantity</w:t>
+              <w:t xml:space="preserve">price</w:t>
             </w:r>
           </w:p>
         </w:tc>
         <w:tc>
           <w:tcPr>
             <w:tcW w:type="dxa" w:w="1420"/>
-            <w:shd w:fill="F1F5F9" w:color="auto" w:val="clear"/>
             <w:tcMar>
               <w:top w:type="dxa" w:w="60"/>
               <w:left w:type="dxa" w:w="100"/>
@@ -13993,7 +14489,6 @@
         <w:tc>
           <w:tcPr>
             <w:tcW w:type="dxa" w:w="2200"/>
-            <w:shd w:fill="F1F5F9" w:color="auto" w:val="clear"/>
             <w:tcMar>
               <w:top w:type="dxa" w:w="60"/>
               <w:left w:type="dxa" w:w="100"/>
@@ -14020,27 +14515,26 @@
         <w:tc>
           <w:tcPr>
             <w:tcW w:type="dxa" w:w="3426"/>
-            <w:shd w:fill="F1F5F9" w:color="auto" w:val="clear"/>
-            <w:tcMar>
-              <w:top w:type="dxa" w:w="60"/>
-              <w:left w:type="dxa" w:w="100"/>
-              <w:bottom w:type="dxa" w:w="60"/>
-              <w:right w:type="dxa" w:w="100"/>
-            </w:tcMar>
-          </w:tcPr>
-          <w:p>
-            <w:pPr>
-              <w:spacing w:after="0" w:before="0"/>
-            </w:pPr>
-            <w:r>
-              <w:rPr>
-                <w:rFonts w:ascii="Calibri" w:cs="Calibri" w:eastAsia="Calibri" w:hAnsi="Calibri"/>
-                <w:b w:val="false"/>
-                <w:bCs w:val="false"/>
-                <w:sz w:val="18"/>
-                <w:szCs w:val="18"/>
-              </w:rPr>
-              <w:t xml:space="preserve">Số lượng</w:t>
+            <w:tcMar>
+              <w:top w:type="dxa" w:w="60"/>
+              <w:left w:type="dxa" w:w="100"/>
+              <w:bottom w:type="dxa" w:w="60"/>
+              <w:right w:type="dxa" w:w="100"/>
+            </w:tcMar>
+          </w:tcPr>
+          <w:p>
+            <w:pPr>
+              <w:spacing w:after="0" w:before="0"/>
+            </w:pPr>
+            <w:r>
+              <w:rPr>
+                <w:rFonts w:ascii="Calibri" w:cs="Calibri" w:eastAsia="Calibri" w:hAnsi="Calibri"/>
+                <w:b w:val="false"/>
+                <w:bCs w:val="false"/>
+                <w:sz w:val="18"/>
+                <w:szCs w:val="18"/>
+              </w:rPr>
+              <w:t xml:space="preserve">Đơn giá lúc mua (snapshot)</w:t>
             </w:r>
           </w:p>
         </w:tc>
@@ -14049,6 +14543,7 @@
         <w:tc>
           <w:tcPr>
             <w:tcW w:type="dxa" w:w="1980"/>
+            <w:shd w:fill="FFFFFF" w:color="auto" w:val="clear"/>
             <w:tcMar>
               <w:top w:type="dxa" w:w="60"/>
               <w:left w:type="dxa" w:w="100"/>
@@ -14068,39 +14563,41 @@
                 <w:sz w:val="18"/>
                 <w:szCs w:val="18"/>
               </w:rPr>
-              <w:t xml:space="preserve">color</w:t>
+              <w:t xml:space="preserve">quantity</w:t>
             </w:r>
           </w:p>
         </w:tc>
         <w:tc>
           <w:tcPr>
             <w:tcW w:type="dxa" w:w="1420"/>
-            <w:tcMar>
-              <w:top w:type="dxa" w:w="60"/>
-              <w:left w:type="dxa" w:w="100"/>
-              <w:bottom w:type="dxa" w:w="60"/>
-              <w:right w:type="dxa" w:w="100"/>
-            </w:tcMar>
-          </w:tcPr>
-          <w:p>
-            <w:pPr>
-              <w:spacing w:after="0" w:before="0"/>
-            </w:pPr>
-            <w:r>
-              <w:rPr>
-                <w:rFonts w:ascii="Calibri" w:cs="Calibri" w:eastAsia="Calibri" w:hAnsi="Calibri"/>
-                <w:b w:val="false"/>
-                <w:bCs w:val="false"/>
-                <w:sz w:val="18"/>
-                <w:szCs w:val="18"/>
-              </w:rPr>
-              <w:t xml:space="preserve">VARCHAR(191)</w:t>
+            <w:shd w:fill="FFFFFF" w:color="auto" w:val="clear"/>
+            <w:tcMar>
+              <w:top w:type="dxa" w:w="60"/>
+              <w:left w:type="dxa" w:w="100"/>
+              <w:bottom w:type="dxa" w:w="60"/>
+              <w:right w:type="dxa" w:w="100"/>
+            </w:tcMar>
+          </w:tcPr>
+          <w:p>
+            <w:pPr>
+              <w:spacing w:after="0" w:before="0"/>
+            </w:pPr>
+            <w:r>
+              <w:rPr>
+                <w:rFonts w:ascii="Calibri" w:cs="Calibri" w:eastAsia="Calibri" w:hAnsi="Calibri"/>
+                <w:b w:val="false"/>
+                <w:bCs w:val="false"/>
+                <w:sz w:val="18"/>
+                <w:szCs w:val="18"/>
+              </w:rPr>
+              <w:t xml:space="preserve">INT</w:t>
             </w:r>
           </w:p>
         </w:tc>
         <w:tc>
           <w:tcPr>
             <w:tcW w:type="dxa" w:w="2200"/>
+            <w:shd w:fill="FFFFFF" w:color="auto" w:val="clear"/>
             <w:tcMar>
               <w:top w:type="dxa" w:w="60"/>
               <w:left w:type="dxa" w:w="100"/>
@@ -14127,26 +14624,27 @@
         <w:tc>
           <w:tcPr>
             <w:tcW w:type="dxa" w:w="3426"/>
-            <w:tcMar>
-              <w:top w:type="dxa" w:w="60"/>
-              <w:left w:type="dxa" w:w="100"/>
-              <w:bottom w:type="dxa" w:w="60"/>
-              <w:right w:type="dxa" w:w="100"/>
-            </w:tcMar>
-          </w:tcPr>
-          <w:p>
-            <w:pPr>
-              <w:spacing w:after="0" w:before="0"/>
-            </w:pPr>
-            <w:r>
-              <w:rPr>
-                <w:rFonts w:ascii="Calibri" w:cs="Calibri" w:eastAsia="Calibri" w:hAnsi="Calibri"/>
-                <w:b w:val="false"/>
-                <w:bCs w:val="false"/>
-                <w:sz w:val="18"/>
-                <w:szCs w:val="18"/>
-              </w:rPr>
-              <w:t xml:space="preserve">Màu đã mua</w:t>
+            <w:shd w:fill="FFFFFF" w:color="auto" w:val="clear"/>
+            <w:tcMar>
+              <w:top w:type="dxa" w:w="60"/>
+              <w:left w:type="dxa" w:w="100"/>
+              <w:bottom w:type="dxa" w:w="60"/>
+              <w:right w:type="dxa" w:w="100"/>
+            </w:tcMar>
+          </w:tcPr>
+          <w:p>
+            <w:pPr>
+              <w:spacing w:after="0" w:before="0"/>
+            </w:pPr>
+            <w:r>
+              <w:rPr>
+                <w:rFonts w:ascii="Calibri" w:cs="Calibri" w:eastAsia="Calibri" w:hAnsi="Calibri"/>
+                <w:b w:val="false"/>
+                <w:bCs w:val="false"/>
+                <w:sz w:val="18"/>
+                <w:szCs w:val="18"/>
+              </w:rPr>
+              <w:t xml:space="preserve">Số lượng</w:t>
             </w:r>
           </w:p>
         </w:tc>
@@ -14155,7 +14653,6 @@
         <w:tc>
           <w:tcPr>
             <w:tcW w:type="dxa" w:w="1980"/>
-            <w:shd w:fill="F1F5F9" w:color="auto" w:val="clear"/>
             <w:tcMar>
               <w:top w:type="dxa" w:w="60"/>
               <w:left w:type="dxa" w:w="100"/>
@@ -14175,14 +14672,13 @@
                 <w:sz w:val="18"/>
                 <w:szCs w:val="18"/>
               </w:rPr>
-              <w:t xml:space="preserve">size</w:t>
+              <w:t xml:space="preserve">color</w:t>
             </w:r>
           </w:p>
         </w:tc>
         <w:tc>
           <w:tcPr>
             <w:tcW w:type="dxa" w:w="1420"/>
-            <w:shd w:fill="F1F5F9" w:color="auto" w:val="clear"/>
             <w:tcMar>
               <w:top w:type="dxa" w:w="60"/>
               <w:left w:type="dxa" w:w="100"/>
@@ -14209,7 +14705,6 @@
         <w:tc>
           <w:tcPr>
             <w:tcW w:type="dxa" w:w="2200"/>
-            <w:shd w:fill="F1F5F9" w:color="auto" w:val="clear"/>
             <w:tcMar>
               <w:top w:type="dxa" w:w="60"/>
               <w:left w:type="dxa" w:w="100"/>
@@ -14236,7 +14731,116 @@
         <w:tc>
           <w:tcPr>
             <w:tcW w:type="dxa" w:w="3426"/>
-            <w:shd w:fill="F1F5F9" w:color="auto" w:val="clear"/>
+            <w:tcMar>
+              <w:top w:type="dxa" w:w="60"/>
+              <w:left w:type="dxa" w:w="100"/>
+              <w:bottom w:type="dxa" w:w="60"/>
+              <w:right w:type="dxa" w:w="100"/>
+            </w:tcMar>
+          </w:tcPr>
+          <w:p>
+            <w:pPr>
+              <w:spacing w:after="0" w:before="0"/>
+            </w:pPr>
+            <w:r>
+              <w:rPr>
+                <w:rFonts w:ascii="Calibri" w:cs="Calibri" w:eastAsia="Calibri" w:hAnsi="Calibri"/>
+                <w:b w:val="false"/>
+                <w:bCs w:val="false"/>
+                <w:sz w:val="18"/>
+                <w:szCs w:val="18"/>
+              </w:rPr>
+              <w:t xml:space="preserve">Màu đã mua</w:t>
+            </w:r>
+          </w:p>
+        </w:tc>
+      </w:tr>
+      <w:tr>
+        <w:tc>
+          <w:tcPr>
+            <w:tcW w:type="dxa" w:w="1980"/>
+            <w:shd w:fill="FFFFFF" w:color="auto" w:val="clear"/>
+            <w:tcMar>
+              <w:top w:type="dxa" w:w="60"/>
+              <w:left w:type="dxa" w:w="100"/>
+              <w:bottom w:type="dxa" w:w="60"/>
+              <w:right w:type="dxa" w:w="100"/>
+            </w:tcMar>
+          </w:tcPr>
+          <w:p>
+            <w:pPr>
+              <w:spacing w:after="0" w:before="0"/>
+            </w:pPr>
+            <w:r>
+              <w:rPr>
+                <w:rFonts w:ascii="Consolas" w:cs="Consolas" w:eastAsia="Consolas" w:hAnsi="Consolas"/>
+                <w:b/>
+                <w:bCs/>
+                <w:sz w:val="18"/>
+                <w:szCs w:val="18"/>
+              </w:rPr>
+              <w:t xml:space="preserve">size</w:t>
+            </w:r>
+          </w:p>
+        </w:tc>
+        <w:tc>
+          <w:tcPr>
+            <w:tcW w:type="dxa" w:w="1420"/>
+            <w:shd w:fill="FFFFFF" w:color="auto" w:val="clear"/>
+            <w:tcMar>
+              <w:top w:type="dxa" w:w="60"/>
+              <w:left w:type="dxa" w:w="100"/>
+              <w:bottom w:type="dxa" w:w="60"/>
+              <w:right w:type="dxa" w:w="100"/>
+            </w:tcMar>
+          </w:tcPr>
+          <w:p>
+            <w:pPr>
+              <w:spacing w:after="0" w:before="0"/>
+            </w:pPr>
+            <w:r>
+              <w:rPr>
+                <w:rFonts w:ascii="Calibri" w:cs="Calibri" w:eastAsia="Calibri" w:hAnsi="Calibri"/>
+                <w:b w:val="false"/>
+                <w:bCs w:val="false"/>
+                <w:sz w:val="18"/>
+                <w:szCs w:val="18"/>
+              </w:rPr>
+              <w:t xml:space="preserve">VARCHAR(191)</w:t>
+            </w:r>
+          </w:p>
+        </w:tc>
+        <w:tc>
+          <w:tcPr>
+            <w:tcW w:type="dxa" w:w="2200"/>
+            <w:shd w:fill="FFFFFF" w:color="auto" w:val="clear"/>
+            <w:tcMar>
+              <w:top w:type="dxa" w:w="60"/>
+              <w:left w:type="dxa" w:w="100"/>
+              <w:bottom w:type="dxa" w:w="60"/>
+              <w:right w:type="dxa" w:w="100"/>
+            </w:tcMar>
+          </w:tcPr>
+          <w:p>
+            <w:pPr>
+              <w:spacing w:after="0" w:before="0"/>
+            </w:pPr>
+            <w:r>
+              <w:rPr>
+                <w:rFonts w:ascii="Calibri" w:cs="Calibri" w:eastAsia="Calibri" w:hAnsi="Calibri"/>
+                <w:b w:val="false"/>
+                <w:bCs w:val="false"/>
+                <w:sz w:val="17"/>
+                <w:szCs w:val="17"/>
+              </w:rPr>
+              <w:t xml:space="preserve">NOT NULL</w:t>
+            </w:r>
+          </w:p>
+        </w:tc>
+        <w:tc>
+          <w:tcPr>
+            <w:tcW w:type="dxa" w:w="3426"/>
+            <w:shd w:fill="FFFFFF" w:color="auto" w:val="clear"/>
             <w:tcMar>
               <w:top w:type="dxa" w:w="60"/>
               <w:left w:type="dxa" w:w="100"/>
@@ -15902,7 +16506,7 @@
                 <w:sz w:val="18"/>
                 <w:szCs w:val="18"/>
               </w:rPr>
-              <w:t xml:space="preserve">gateway</w:t>
+              <w:t xml:space="preserve">orderId</w:t>
             </w:r>
           </w:p>
         </w:tc>
@@ -15954,7 +16558,7 @@
                 <w:sz w:val="17"/>
                 <w:szCs w:val="17"/>
               </w:rPr>
-              <w:t xml:space="preserve">NULL</w:t>
+              <w:t xml:space="preserve">FK → Order.id, NULL, ON DELETE SET NULL</w:t>
             </w:r>
           </w:p>
         </w:tc>
@@ -15980,7 +16584,7 @@
                 <w:sz w:val="18"/>
                 <w:szCs w:val="18"/>
               </w:rPr>
-              <w:t xml:space="preserve">Ngân hàng, vd MBBank</w:t>
+              <w:t xml:space="preserve">Đơn khớp được với giao dịch (NULL khi chưa khớp)</w:t>
             </w:r>
           </w:p>
         </w:tc>
@@ -15989,7 +16593,6 @@
         <w:tc>
           <w:tcPr>
             <w:tcW w:type="dxa" w:w="1980"/>
-            <w:shd w:fill="F1F5F9" w:color="auto" w:val="clear"/>
             <w:tcMar>
               <w:top w:type="dxa" w:w="60"/>
               <w:left w:type="dxa" w:w="100"/>
@@ -16009,14 +16612,13 @@
                 <w:sz w:val="18"/>
                 <w:szCs w:val="18"/>
               </w:rPr>
-              <w:t xml:space="preserve">payCode</w:t>
+              <w:t xml:space="preserve">gateway</w:t>
             </w:r>
           </w:p>
         </w:tc>
         <w:tc>
           <w:tcPr>
             <w:tcW w:type="dxa" w:w="1420"/>
-            <w:shd w:fill="F1F5F9" w:color="auto" w:val="clear"/>
             <w:tcMar>
               <w:top w:type="dxa" w:w="60"/>
               <w:left w:type="dxa" w:w="100"/>
@@ -16043,7 +16645,6 @@
         <w:tc>
           <w:tcPr>
             <w:tcW w:type="dxa" w:w="2200"/>
-            <w:shd w:fill="F1F5F9" w:color="auto" w:val="clear"/>
             <w:tcMar>
               <w:top w:type="dxa" w:w="60"/>
               <w:left w:type="dxa" w:w="100"/>
@@ -16070,27 +16671,26 @@
         <w:tc>
           <w:tcPr>
             <w:tcW w:type="dxa" w:w="3426"/>
-            <w:shd w:fill="F1F5F9" w:color="auto" w:val="clear"/>
-            <w:tcMar>
-              <w:top w:type="dxa" w:w="60"/>
-              <w:left w:type="dxa" w:w="100"/>
-              <w:bottom w:type="dxa" w:w="60"/>
-              <w:right w:type="dxa" w:w="100"/>
-            </w:tcMar>
-          </w:tcPr>
-          <w:p>
-            <w:pPr>
-              <w:spacing w:after="0" w:before="0"/>
-            </w:pPr>
-            <w:r>
-              <w:rPr>
-                <w:rFonts w:ascii="Calibri" w:cs="Calibri" w:eastAsia="Calibri" w:hAnsi="Calibri"/>
-                <w:b w:val="false"/>
-                <w:bCs w:val="false"/>
-                <w:sz w:val="18"/>
-                <w:szCs w:val="18"/>
-              </w:rPr>
-              <w:t xml:space="preserve">Mã trong nội dung chuyển khoản</w:t>
+            <w:tcMar>
+              <w:top w:type="dxa" w:w="60"/>
+              <w:left w:type="dxa" w:w="100"/>
+              <w:bottom w:type="dxa" w:w="60"/>
+              <w:right w:type="dxa" w:w="100"/>
+            </w:tcMar>
+          </w:tcPr>
+          <w:p>
+            <w:pPr>
+              <w:spacing w:after="0" w:before="0"/>
+            </w:pPr>
+            <w:r>
+              <w:rPr>
+                <w:rFonts w:ascii="Calibri" w:cs="Calibri" w:eastAsia="Calibri" w:hAnsi="Calibri"/>
+                <w:b w:val="false"/>
+                <w:bCs w:val="false"/>
+                <w:sz w:val="18"/>
+                <w:szCs w:val="18"/>
+              </w:rPr>
+              <w:t xml:space="preserve">Ngân hàng, vd MBBank</w:t>
             </w:r>
           </w:p>
         </w:tc>
@@ -16099,6 +16699,7 @@
         <w:tc>
           <w:tcPr>
             <w:tcW w:type="dxa" w:w="1980"/>
+            <w:shd w:fill="FFFFFF" w:color="auto" w:val="clear"/>
             <w:tcMar>
               <w:top w:type="dxa" w:w="60"/>
               <w:left w:type="dxa" w:w="100"/>
@@ -16118,39 +16719,41 @@
                 <w:sz w:val="18"/>
                 <w:szCs w:val="18"/>
               </w:rPr>
-              <w:t xml:space="preserve">amount</w:t>
+              <w:t xml:space="preserve">payCode</w:t>
             </w:r>
           </w:p>
         </w:tc>
         <w:tc>
           <w:tcPr>
             <w:tcW w:type="dxa" w:w="1420"/>
-            <w:tcMar>
-              <w:top w:type="dxa" w:w="60"/>
-              <w:left w:type="dxa" w:w="100"/>
-              <w:bottom w:type="dxa" w:w="60"/>
-              <w:right w:type="dxa" w:w="100"/>
-            </w:tcMar>
-          </w:tcPr>
-          <w:p>
-            <w:pPr>
-              <w:spacing w:after="0" w:before="0"/>
-            </w:pPr>
-            <w:r>
-              <w:rPr>
-                <w:rFonts w:ascii="Calibri" w:cs="Calibri" w:eastAsia="Calibri" w:hAnsi="Calibri"/>
-                <w:b w:val="false"/>
-                <w:bCs w:val="false"/>
-                <w:sz w:val="18"/>
-                <w:szCs w:val="18"/>
-              </w:rPr>
-              <w:t xml:space="preserve">INT</w:t>
+            <w:shd w:fill="FFFFFF" w:color="auto" w:val="clear"/>
+            <w:tcMar>
+              <w:top w:type="dxa" w:w="60"/>
+              <w:left w:type="dxa" w:w="100"/>
+              <w:bottom w:type="dxa" w:w="60"/>
+              <w:right w:type="dxa" w:w="100"/>
+            </w:tcMar>
+          </w:tcPr>
+          <w:p>
+            <w:pPr>
+              <w:spacing w:after="0" w:before="0"/>
+            </w:pPr>
+            <w:r>
+              <w:rPr>
+                <w:rFonts w:ascii="Calibri" w:cs="Calibri" w:eastAsia="Calibri" w:hAnsi="Calibri"/>
+                <w:b w:val="false"/>
+                <w:bCs w:val="false"/>
+                <w:sz w:val="18"/>
+                <w:szCs w:val="18"/>
+              </w:rPr>
+              <w:t xml:space="preserve">VARCHAR(191)</w:t>
             </w:r>
           </w:p>
         </w:tc>
         <w:tc>
           <w:tcPr>
             <w:tcW w:type="dxa" w:w="2200"/>
+            <w:shd w:fill="FFFFFF" w:color="auto" w:val="clear"/>
             <w:tcMar>
               <w:top w:type="dxa" w:w="60"/>
               <w:left w:type="dxa" w:w="100"/>
@@ -16170,33 +16773,34 @@
                 <w:sz w:val="17"/>
                 <w:szCs w:val="17"/>
               </w:rPr>
-              <w:t xml:space="preserve">NOT NULL, DEFAULT 0</w:t>
+              <w:t xml:space="preserve">NULL</w:t>
             </w:r>
           </w:p>
         </w:tc>
         <w:tc>
           <w:tcPr>
             <w:tcW w:type="dxa" w:w="3426"/>
-            <w:tcMar>
-              <w:top w:type="dxa" w:w="60"/>
-              <w:left w:type="dxa" w:w="100"/>
-              <w:bottom w:type="dxa" w:w="60"/>
-              <w:right w:type="dxa" w:w="100"/>
-            </w:tcMar>
-          </w:tcPr>
-          <w:p>
-            <w:pPr>
-              <w:spacing w:after="0" w:before="0"/>
-            </w:pPr>
-            <w:r>
-              <w:rPr>
-                <w:rFonts w:ascii="Calibri" w:cs="Calibri" w:eastAsia="Calibri" w:hAnsi="Calibri"/>
-                <w:b w:val="false"/>
-                <w:bCs w:val="false"/>
-                <w:sz w:val="18"/>
-                <w:szCs w:val="18"/>
-              </w:rPr>
-              <w:t xml:space="preserve">Số tiền giao dịch</w:t>
+            <w:shd w:fill="FFFFFF" w:color="auto" w:val="clear"/>
+            <w:tcMar>
+              <w:top w:type="dxa" w:w="60"/>
+              <w:left w:type="dxa" w:w="100"/>
+              <w:bottom w:type="dxa" w:w="60"/>
+              <w:right w:type="dxa" w:w="100"/>
+            </w:tcMar>
+          </w:tcPr>
+          <w:p>
+            <w:pPr>
+              <w:spacing w:after="0" w:before="0"/>
+            </w:pPr>
+            <w:r>
+              <w:rPr>
+                <w:rFonts w:ascii="Calibri" w:cs="Calibri" w:eastAsia="Calibri" w:hAnsi="Calibri"/>
+                <w:b w:val="false"/>
+                <w:bCs w:val="false"/>
+                <w:sz w:val="18"/>
+                <w:szCs w:val="18"/>
+              </w:rPr>
+              <w:t xml:space="preserve">Mã trong nội dung chuyển khoản</w:t>
             </w:r>
           </w:p>
         </w:tc>
@@ -16205,7 +16809,6 @@
         <w:tc>
           <w:tcPr>
             <w:tcW w:type="dxa" w:w="1980"/>
-            <w:shd w:fill="F1F5F9" w:color="auto" w:val="clear"/>
             <w:tcMar>
               <w:top w:type="dxa" w:w="60"/>
               <w:left w:type="dxa" w:w="100"/>
@@ -16225,41 +16828,39 @@
                 <w:sz w:val="18"/>
                 <w:szCs w:val="18"/>
               </w:rPr>
-              <w:t xml:space="preserve">transferType</w:t>
+              <w:t xml:space="preserve">amount</w:t>
             </w:r>
           </w:p>
         </w:tc>
         <w:tc>
           <w:tcPr>
             <w:tcW w:type="dxa" w:w="1420"/>
-            <w:shd w:fill="F1F5F9" w:color="auto" w:val="clear"/>
-            <w:tcMar>
-              <w:top w:type="dxa" w:w="60"/>
-              <w:left w:type="dxa" w:w="100"/>
-              <w:bottom w:type="dxa" w:w="60"/>
-              <w:right w:type="dxa" w:w="100"/>
-            </w:tcMar>
-          </w:tcPr>
-          <w:p>
-            <w:pPr>
-              <w:spacing w:after="0" w:before="0"/>
-            </w:pPr>
-            <w:r>
-              <w:rPr>
-                <w:rFonts w:ascii="Calibri" w:cs="Calibri" w:eastAsia="Calibri" w:hAnsi="Calibri"/>
-                <w:b w:val="false"/>
-                <w:bCs w:val="false"/>
-                <w:sz w:val="18"/>
-                <w:szCs w:val="18"/>
-              </w:rPr>
-              <w:t xml:space="preserve">VARCHAR(191)</w:t>
+            <w:tcMar>
+              <w:top w:type="dxa" w:w="60"/>
+              <w:left w:type="dxa" w:w="100"/>
+              <w:bottom w:type="dxa" w:w="60"/>
+              <w:right w:type="dxa" w:w="100"/>
+            </w:tcMar>
+          </w:tcPr>
+          <w:p>
+            <w:pPr>
+              <w:spacing w:after="0" w:before="0"/>
+            </w:pPr>
+            <w:r>
+              <w:rPr>
+                <w:rFonts w:ascii="Calibri" w:cs="Calibri" w:eastAsia="Calibri" w:hAnsi="Calibri"/>
+                <w:b w:val="false"/>
+                <w:bCs w:val="false"/>
+                <w:sz w:val="18"/>
+                <w:szCs w:val="18"/>
+              </w:rPr>
+              <w:t xml:space="preserve">INT</w:t>
             </w:r>
           </w:p>
         </w:tc>
         <w:tc>
           <w:tcPr>
             <w:tcW w:type="dxa" w:w="2200"/>
-            <w:shd w:fill="F1F5F9" w:color="auto" w:val="clear"/>
             <w:tcMar>
               <w:top w:type="dxa" w:w="60"/>
               <w:left w:type="dxa" w:w="100"/>
@@ -16279,34 +16880,33 @@
                 <w:sz w:val="17"/>
                 <w:szCs w:val="17"/>
               </w:rPr>
-              <w:t xml:space="preserve">NULL</w:t>
+              <w:t xml:space="preserve">NOT NULL, DEFAULT 0</w:t>
             </w:r>
           </w:p>
         </w:tc>
         <w:tc>
           <w:tcPr>
             <w:tcW w:type="dxa" w:w="3426"/>
-            <w:shd w:fill="F1F5F9" w:color="auto" w:val="clear"/>
-            <w:tcMar>
-              <w:top w:type="dxa" w:w="60"/>
-              <w:left w:type="dxa" w:w="100"/>
-              <w:bottom w:type="dxa" w:w="60"/>
-              <w:right w:type="dxa" w:w="100"/>
-            </w:tcMar>
-          </w:tcPr>
-          <w:p>
-            <w:pPr>
-              <w:spacing w:after="0" w:before="0"/>
-            </w:pPr>
-            <w:r>
-              <w:rPr>
-                <w:rFonts w:ascii="Calibri" w:cs="Calibri" w:eastAsia="Calibri" w:hAnsi="Calibri"/>
-                <w:b w:val="false"/>
-                <w:bCs w:val="false"/>
-                <w:sz w:val="18"/>
-                <w:szCs w:val="18"/>
-              </w:rPr>
-              <w:t xml:space="preserve">in (tiền vào) | out (tiền ra)</w:t>
+            <w:tcMar>
+              <w:top w:type="dxa" w:w="60"/>
+              <w:left w:type="dxa" w:w="100"/>
+              <w:bottom w:type="dxa" w:w="60"/>
+              <w:right w:type="dxa" w:w="100"/>
+            </w:tcMar>
+          </w:tcPr>
+          <w:p>
+            <w:pPr>
+              <w:spacing w:after="0" w:before="0"/>
+            </w:pPr>
+            <w:r>
+              <w:rPr>
+                <w:rFonts w:ascii="Calibri" w:cs="Calibri" w:eastAsia="Calibri" w:hAnsi="Calibri"/>
+                <w:b w:val="false"/>
+                <w:bCs w:val="false"/>
+                <w:sz w:val="18"/>
+                <w:szCs w:val="18"/>
+              </w:rPr>
+              <w:t xml:space="preserve">Số tiền giao dịch</w:t>
             </w:r>
           </w:p>
         </w:tc>
@@ -16315,6 +16915,7 @@
         <w:tc>
           <w:tcPr>
             <w:tcW w:type="dxa" w:w="1980"/>
+            <w:shd w:fill="FFFFFF" w:color="auto" w:val="clear"/>
             <w:tcMar>
               <w:top w:type="dxa" w:w="60"/>
               <w:left w:type="dxa" w:w="100"/>
@@ -16334,13 +16935,14 @@
                 <w:sz w:val="18"/>
                 <w:szCs w:val="18"/>
               </w:rPr>
-              <w:t xml:space="preserve">referenceCode</w:t>
+              <w:t xml:space="preserve">transferType</w:t>
             </w:r>
           </w:p>
         </w:tc>
         <w:tc>
           <w:tcPr>
             <w:tcW w:type="dxa" w:w="1420"/>
+            <w:shd w:fill="FFFFFF" w:color="auto" w:val="clear"/>
             <w:tcMar>
               <w:top w:type="dxa" w:w="60"/>
               <w:left w:type="dxa" w:w="100"/>
@@ -16367,6 +16969,7 @@
         <w:tc>
           <w:tcPr>
             <w:tcW w:type="dxa" w:w="2200"/>
+            <w:shd w:fill="FFFFFF" w:color="auto" w:val="clear"/>
             <w:tcMar>
               <w:top w:type="dxa" w:w="60"/>
               <w:left w:type="dxa" w:w="100"/>
@@ -16393,26 +16996,27 @@
         <w:tc>
           <w:tcPr>
             <w:tcW w:type="dxa" w:w="3426"/>
-            <w:tcMar>
-              <w:top w:type="dxa" w:w="60"/>
-              <w:left w:type="dxa" w:w="100"/>
-              <w:bottom w:type="dxa" w:w="60"/>
-              <w:right w:type="dxa" w:w="100"/>
-            </w:tcMar>
-          </w:tcPr>
-          <w:p>
-            <w:pPr>
-              <w:spacing w:after="0" w:before="0"/>
-            </w:pPr>
-            <w:r>
-              <w:rPr>
-                <w:rFonts w:ascii="Calibri" w:cs="Calibri" w:eastAsia="Calibri" w:hAnsi="Calibri"/>
-                <w:b w:val="false"/>
-                <w:bCs w:val="false"/>
-                <w:sz w:val="18"/>
-                <w:szCs w:val="18"/>
-              </w:rPr>
-              <w:t xml:space="preserve">Mã tham chiếu của ngân hàng</w:t>
+            <w:shd w:fill="FFFFFF" w:color="auto" w:val="clear"/>
+            <w:tcMar>
+              <w:top w:type="dxa" w:w="60"/>
+              <w:left w:type="dxa" w:w="100"/>
+              <w:bottom w:type="dxa" w:w="60"/>
+              <w:right w:type="dxa" w:w="100"/>
+            </w:tcMar>
+          </w:tcPr>
+          <w:p>
+            <w:pPr>
+              <w:spacing w:after="0" w:before="0"/>
+            </w:pPr>
+            <w:r>
+              <w:rPr>
+                <w:rFonts w:ascii="Calibri" w:cs="Calibri" w:eastAsia="Calibri" w:hAnsi="Calibri"/>
+                <w:b w:val="false"/>
+                <w:bCs w:val="false"/>
+                <w:sz w:val="18"/>
+                <w:szCs w:val="18"/>
+              </w:rPr>
+              <w:t xml:space="preserve">in (tiền vào) | out (tiền ra)</w:t>
             </w:r>
           </w:p>
         </w:tc>
@@ -16421,7 +17025,6 @@
         <w:tc>
           <w:tcPr>
             <w:tcW w:type="dxa" w:w="1980"/>
-            <w:shd w:fill="F1F5F9" w:color="auto" w:val="clear"/>
             <w:tcMar>
               <w:top w:type="dxa" w:w="60"/>
               <w:left w:type="dxa" w:w="100"/>
@@ -16441,41 +17044,39 @@
                 <w:sz w:val="18"/>
                 <w:szCs w:val="18"/>
               </w:rPr>
-              <w:t xml:space="preserve">matched</w:t>
+              <w:t xml:space="preserve">referenceCode</w:t>
             </w:r>
           </w:p>
         </w:tc>
         <w:tc>
           <w:tcPr>
             <w:tcW w:type="dxa" w:w="1420"/>
-            <w:shd w:fill="F1F5F9" w:color="auto" w:val="clear"/>
-            <w:tcMar>
-              <w:top w:type="dxa" w:w="60"/>
-              <w:left w:type="dxa" w:w="100"/>
-              <w:bottom w:type="dxa" w:w="60"/>
-              <w:right w:type="dxa" w:w="100"/>
-            </w:tcMar>
-          </w:tcPr>
-          <w:p>
-            <w:pPr>
-              <w:spacing w:after="0" w:before="0"/>
-            </w:pPr>
-            <w:r>
-              <w:rPr>
-                <w:rFonts w:ascii="Calibri" w:cs="Calibri" w:eastAsia="Calibri" w:hAnsi="Calibri"/>
-                <w:b w:val="false"/>
-                <w:bCs w:val="false"/>
-                <w:sz w:val="18"/>
-                <w:szCs w:val="18"/>
-              </w:rPr>
-              <w:t xml:space="preserve">TINYINT(1)</w:t>
+            <w:tcMar>
+              <w:top w:type="dxa" w:w="60"/>
+              <w:left w:type="dxa" w:w="100"/>
+              <w:bottom w:type="dxa" w:w="60"/>
+              <w:right w:type="dxa" w:w="100"/>
+            </w:tcMar>
+          </w:tcPr>
+          <w:p>
+            <w:pPr>
+              <w:spacing w:after="0" w:before="0"/>
+            </w:pPr>
+            <w:r>
+              <w:rPr>
+                <w:rFonts w:ascii="Calibri" w:cs="Calibri" w:eastAsia="Calibri" w:hAnsi="Calibri"/>
+                <w:b w:val="false"/>
+                <w:bCs w:val="false"/>
+                <w:sz w:val="18"/>
+                <w:szCs w:val="18"/>
+              </w:rPr>
+              <w:t xml:space="preserve">VARCHAR(191)</w:t>
             </w:r>
           </w:p>
         </w:tc>
         <w:tc>
           <w:tcPr>
             <w:tcW w:type="dxa" w:w="2200"/>
-            <w:shd w:fill="F1F5F9" w:color="auto" w:val="clear"/>
             <w:tcMar>
               <w:top w:type="dxa" w:w="60"/>
               <w:left w:type="dxa" w:w="100"/>
@@ -16495,34 +17096,33 @@
                 <w:sz w:val="17"/>
                 <w:szCs w:val="17"/>
               </w:rPr>
-              <w:t xml:space="preserve">NOT NULL, DEFAULT 0</w:t>
+              <w:t xml:space="preserve">NULL</w:t>
             </w:r>
           </w:p>
         </w:tc>
         <w:tc>
           <w:tcPr>
             <w:tcW w:type="dxa" w:w="3426"/>
-            <w:shd w:fill="F1F5F9" w:color="auto" w:val="clear"/>
-            <w:tcMar>
-              <w:top w:type="dxa" w:w="60"/>
-              <w:left w:type="dxa" w:w="100"/>
-              <w:bottom w:type="dxa" w:w="60"/>
-              <w:right w:type="dxa" w:w="100"/>
-            </w:tcMar>
-          </w:tcPr>
-          <w:p>
-            <w:pPr>
-              <w:spacing w:after="0" w:before="0"/>
-            </w:pPr>
-            <w:r>
-              <w:rPr>
-                <w:rFonts w:ascii="Calibri" w:cs="Calibri" w:eastAsia="Calibri" w:hAnsi="Calibri"/>
-                <w:b w:val="false"/>
-                <w:bCs w:val="false"/>
-                <w:sz w:val="18"/>
-                <w:szCs w:val="18"/>
-              </w:rPr>
-              <w:t xml:space="preserve">Đã khớp được với một đơn hàng</w:t>
+            <w:tcMar>
+              <w:top w:type="dxa" w:w="60"/>
+              <w:left w:type="dxa" w:w="100"/>
+              <w:bottom w:type="dxa" w:w="60"/>
+              <w:right w:type="dxa" w:w="100"/>
+            </w:tcMar>
+          </w:tcPr>
+          <w:p>
+            <w:pPr>
+              <w:spacing w:after="0" w:before="0"/>
+            </w:pPr>
+            <w:r>
+              <w:rPr>
+                <w:rFonts w:ascii="Calibri" w:cs="Calibri" w:eastAsia="Calibri" w:hAnsi="Calibri"/>
+                <w:b w:val="false"/>
+                <w:bCs w:val="false"/>
+                <w:sz w:val="18"/>
+                <w:szCs w:val="18"/>
+              </w:rPr>
+              <w:t xml:space="preserve">Mã tham chiếu của ngân hàng</w:t>
             </w:r>
           </w:p>
         </w:tc>
@@ -16531,6 +17131,7 @@
         <w:tc>
           <w:tcPr>
             <w:tcW w:type="dxa" w:w="1980"/>
+            <w:shd w:fill="FFFFFF" w:color="auto" w:val="clear"/>
             <w:tcMar>
               <w:top w:type="dxa" w:w="60"/>
               <w:left w:type="dxa" w:w="100"/>
@@ -16550,39 +17151,41 @@
                 <w:sz w:val="18"/>
                 <w:szCs w:val="18"/>
               </w:rPr>
-              <w:t xml:space="preserve">rawBody</w:t>
+              <w:t xml:space="preserve">matched</w:t>
             </w:r>
           </w:p>
         </w:tc>
         <w:tc>
           <w:tcPr>
             <w:tcW w:type="dxa" w:w="1420"/>
-            <w:tcMar>
-              <w:top w:type="dxa" w:w="60"/>
-              <w:left w:type="dxa" w:w="100"/>
-              <w:bottom w:type="dxa" w:w="60"/>
-              <w:right w:type="dxa" w:w="100"/>
-            </w:tcMar>
-          </w:tcPr>
-          <w:p>
-            <w:pPr>
-              <w:spacing w:after="0" w:before="0"/>
-            </w:pPr>
-            <w:r>
-              <w:rPr>
-                <w:rFonts w:ascii="Calibri" w:cs="Calibri" w:eastAsia="Calibri" w:hAnsi="Calibri"/>
-                <w:b w:val="false"/>
-                <w:bCs w:val="false"/>
-                <w:sz w:val="18"/>
-                <w:szCs w:val="18"/>
-              </w:rPr>
-              <w:t xml:space="preserve">TEXT</w:t>
+            <w:shd w:fill="FFFFFF" w:color="auto" w:val="clear"/>
+            <w:tcMar>
+              <w:top w:type="dxa" w:w="60"/>
+              <w:left w:type="dxa" w:w="100"/>
+              <w:bottom w:type="dxa" w:w="60"/>
+              <w:right w:type="dxa" w:w="100"/>
+            </w:tcMar>
+          </w:tcPr>
+          <w:p>
+            <w:pPr>
+              <w:spacing w:after="0" w:before="0"/>
+            </w:pPr>
+            <w:r>
+              <w:rPr>
+                <w:rFonts w:ascii="Calibri" w:cs="Calibri" w:eastAsia="Calibri" w:hAnsi="Calibri"/>
+                <w:b w:val="false"/>
+                <w:bCs w:val="false"/>
+                <w:sz w:val="18"/>
+                <w:szCs w:val="18"/>
+              </w:rPr>
+              <w:t xml:space="preserve">TINYINT(1)</w:t>
             </w:r>
           </w:p>
         </w:tc>
         <w:tc>
           <w:tcPr>
             <w:tcW w:type="dxa" w:w="2200"/>
+            <w:shd w:fill="FFFFFF" w:color="auto" w:val="clear"/>
             <w:tcMar>
               <w:top w:type="dxa" w:w="60"/>
               <w:left w:type="dxa" w:w="100"/>
@@ -16602,33 +17205,34 @@
                 <w:sz w:val="17"/>
                 <w:szCs w:val="17"/>
               </w:rPr>
-              <w:t xml:space="preserve">NOT NULL</w:t>
+              <w:t xml:space="preserve">NOT NULL, DEFAULT 0</w:t>
             </w:r>
           </w:p>
         </w:tc>
         <w:tc>
           <w:tcPr>
             <w:tcW w:type="dxa" w:w="3426"/>
-            <w:tcMar>
-              <w:top w:type="dxa" w:w="60"/>
-              <w:left w:type="dxa" w:w="100"/>
-              <w:bottom w:type="dxa" w:w="60"/>
-              <w:right w:type="dxa" w:w="100"/>
-            </w:tcMar>
-          </w:tcPr>
-          <w:p>
-            <w:pPr>
-              <w:spacing w:after="0" w:before="0"/>
-            </w:pPr>
-            <w:r>
-              <w:rPr>
-                <w:rFonts w:ascii="Calibri" w:cs="Calibri" w:eastAsia="Calibri" w:hAnsi="Calibri"/>
-                <w:b w:val="false"/>
-                <w:bCs w:val="false"/>
-                <w:sz w:val="18"/>
-                <w:szCs w:val="18"/>
-              </w:rPr>
-              <w:t xml:space="preserve">Payload gốc của webhook</w:t>
+            <w:shd w:fill="FFFFFF" w:color="auto" w:val="clear"/>
+            <w:tcMar>
+              <w:top w:type="dxa" w:w="60"/>
+              <w:left w:type="dxa" w:w="100"/>
+              <w:bottom w:type="dxa" w:w="60"/>
+              <w:right w:type="dxa" w:w="100"/>
+            </w:tcMar>
+          </w:tcPr>
+          <w:p>
+            <w:pPr>
+              <w:spacing w:after="0" w:before="0"/>
+            </w:pPr>
+            <w:r>
+              <w:rPr>
+                <w:rFonts w:ascii="Calibri" w:cs="Calibri" w:eastAsia="Calibri" w:hAnsi="Calibri"/>
+                <w:b w:val="false"/>
+                <w:bCs w:val="false"/>
+                <w:sz w:val="18"/>
+                <w:szCs w:val="18"/>
+              </w:rPr>
+              <w:t xml:space="preserve">Đã khớp được với một đơn hàng</w:t>
             </w:r>
           </w:p>
         </w:tc>
@@ -16637,7 +17241,6 @@
         <w:tc>
           <w:tcPr>
             <w:tcW w:type="dxa" w:w="1980"/>
-            <w:shd w:fill="F1F5F9" w:color="auto" w:val="clear"/>
             <w:tcMar>
               <w:top w:type="dxa" w:w="60"/>
               <w:left w:type="dxa" w:w="100"/>
@@ -16657,41 +17260,39 @@
                 <w:sz w:val="18"/>
                 <w:szCs w:val="18"/>
               </w:rPr>
-              <w:t xml:space="preserve">createdAt</w:t>
+              <w:t xml:space="preserve">rawBody</w:t>
             </w:r>
           </w:p>
         </w:tc>
         <w:tc>
           <w:tcPr>
             <w:tcW w:type="dxa" w:w="1420"/>
-            <w:shd w:fill="F1F5F9" w:color="auto" w:val="clear"/>
-            <w:tcMar>
-              <w:top w:type="dxa" w:w="60"/>
-              <w:left w:type="dxa" w:w="100"/>
-              <w:bottom w:type="dxa" w:w="60"/>
-              <w:right w:type="dxa" w:w="100"/>
-            </w:tcMar>
-          </w:tcPr>
-          <w:p>
-            <w:pPr>
-              <w:spacing w:after="0" w:before="0"/>
-            </w:pPr>
-            <w:r>
-              <w:rPr>
-                <w:rFonts w:ascii="Calibri" w:cs="Calibri" w:eastAsia="Calibri" w:hAnsi="Calibri"/>
-                <w:b w:val="false"/>
-                <w:bCs w:val="false"/>
-                <w:sz w:val="18"/>
-                <w:szCs w:val="18"/>
-              </w:rPr>
-              <w:t xml:space="preserve">DATETIME(3)</w:t>
+            <w:tcMar>
+              <w:top w:type="dxa" w:w="60"/>
+              <w:left w:type="dxa" w:w="100"/>
+              <w:bottom w:type="dxa" w:w="60"/>
+              <w:right w:type="dxa" w:w="100"/>
+            </w:tcMar>
+          </w:tcPr>
+          <w:p>
+            <w:pPr>
+              <w:spacing w:after="0" w:before="0"/>
+            </w:pPr>
+            <w:r>
+              <w:rPr>
+                <w:rFonts w:ascii="Calibri" w:cs="Calibri" w:eastAsia="Calibri" w:hAnsi="Calibri"/>
+                <w:b w:val="false"/>
+                <w:bCs w:val="false"/>
+                <w:sz w:val="18"/>
+                <w:szCs w:val="18"/>
+              </w:rPr>
+              <w:t xml:space="preserve">TEXT</w:t>
             </w:r>
           </w:p>
         </w:tc>
         <w:tc>
           <w:tcPr>
             <w:tcW w:type="dxa" w:w="2200"/>
-            <w:shd w:fill="F1F5F9" w:color="auto" w:val="clear"/>
             <w:tcMar>
               <w:top w:type="dxa" w:w="60"/>
               <w:left w:type="dxa" w:w="100"/>
@@ -16711,6 +17312,115 @@
                 <w:sz w:val="17"/>
                 <w:szCs w:val="17"/>
               </w:rPr>
+              <w:t xml:space="preserve">NOT NULL</w:t>
+            </w:r>
+          </w:p>
+        </w:tc>
+        <w:tc>
+          <w:tcPr>
+            <w:tcW w:type="dxa" w:w="3426"/>
+            <w:tcMar>
+              <w:top w:type="dxa" w:w="60"/>
+              <w:left w:type="dxa" w:w="100"/>
+              <w:bottom w:type="dxa" w:w="60"/>
+              <w:right w:type="dxa" w:w="100"/>
+            </w:tcMar>
+          </w:tcPr>
+          <w:p>
+            <w:pPr>
+              <w:spacing w:after="0" w:before="0"/>
+            </w:pPr>
+            <w:r>
+              <w:rPr>
+                <w:rFonts w:ascii="Calibri" w:cs="Calibri" w:eastAsia="Calibri" w:hAnsi="Calibri"/>
+                <w:b w:val="false"/>
+                <w:bCs w:val="false"/>
+                <w:sz w:val="18"/>
+                <w:szCs w:val="18"/>
+              </w:rPr>
+              <w:t xml:space="preserve">Payload gốc của webhook</w:t>
+            </w:r>
+          </w:p>
+        </w:tc>
+      </w:tr>
+      <w:tr>
+        <w:tc>
+          <w:tcPr>
+            <w:tcW w:type="dxa" w:w="1980"/>
+            <w:shd w:fill="FFFFFF" w:color="auto" w:val="clear"/>
+            <w:tcMar>
+              <w:top w:type="dxa" w:w="60"/>
+              <w:left w:type="dxa" w:w="100"/>
+              <w:bottom w:type="dxa" w:w="60"/>
+              <w:right w:type="dxa" w:w="100"/>
+            </w:tcMar>
+          </w:tcPr>
+          <w:p>
+            <w:pPr>
+              <w:spacing w:after="0" w:before="0"/>
+            </w:pPr>
+            <w:r>
+              <w:rPr>
+                <w:rFonts w:ascii="Consolas" w:cs="Consolas" w:eastAsia="Consolas" w:hAnsi="Consolas"/>
+                <w:b/>
+                <w:bCs/>
+                <w:sz w:val="18"/>
+                <w:szCs w:val="18"/>
+              </w:rPr>
+              <w:t xml:space="preserve">createdAt</w:t>
+            </w:r>
+          </w:p>
+        </w:tc>
+        <w:tc>
+          <w:tcPr>
+            <w:tcW w:type="dxa" w:w="1420"/>
+            <w:shd w:fill="FFFFFF" w:color="auto" w:val="clear"/>
+            <w:tcMar>
+              <w:top w:type="dxa" w:w="60"/>
+              <w:left w:type="dxa" w:w="100"/>
+              <w:bottom w:type="dxa" w:w="60"/>
+              <w:right w:type="dxa" w:w="100"/>
+            </w:tcMar>
+          </w:tcPr>
+          <w:p>
+            <w:pPr>
+              <w:spacing w:after="0" w:before="0"/>
+            </w:pPr>
+            <w:r>
+              <w:rPr>
+                <w:rFonts w:ascii="Calibri" w:cs="Calibri" w:eastAsia="Calibri" w:hAnsi="Calibri"/>
+                <w:b w:val="false"/>
+                <w:bCs w:val="false"/>
+                <w:sz w:val="18"/>
+                <w:szCs w:val="18"/>
+              </w:rPr>
+              <w:t xml:space="preserve">DATETIME(3)</w:t>
+            </w:r>
+          </w:p>
+        </w:tc>
+        <w:tc>
+          <w:tcPr>
+            <w:tcW w:type="dxa" w:w="2200"/>
+            <w:shd w:fill="FFFFFF" w:color="auto" w:val="clear"/>
+            <w:tcMar>
+              <w:top w:type="dxa" w:w="60"/>
+              <w:left w:type="dxa" w:w="100"/>
+              <w:bottom w:type="dxa" w:w="60"/>
+              <w:right w:type="dxa" w:w="100"/>
+            </w:tcMar>
+          </w:tcPr>
+          <w:p>
+            <w:pPr>
+              <w:spacing w:after="0" w:before="0"/>
+            </w:pPr>
+            <w:r>
+              <w:rPr>
+                <w:rFonts w:ascii="Calibri" w:cs="Calibri" w:eastAsia="Calibri" w:hAnsi="Calibri"/>
+                <w:b w:val="false"/>
+                <w:bCs w:val="false"/>
+                <w:sz w:val="17"/>
+                <w:szCs w:val="17"/>
+              </w:rPr>
               <w:t xml:space="preserve">NOT NULL, DEFAULT now()</w:t>
             </w:r>
           </w:p>
@@ -16718,7 +17428,7 @@
         <w:tc>
           <w:tcPr>
             <w:tcW w:type="dxa" w:w="3426"/>
-            <w:shd w:fill="F1F5F9" w:color="auto" w:val="clear"/>
+            <w:shd w:fill="FFFFFF" w:color="auto" w:val="clear"/>
             <w:tcMar>
               <w:top w:type="dxa" w:w="60"/>
               <w:left w:type="dxa" w:w="100"/>
@@ -18365,7 +19075,6 @@
         <w:tc>
           <w:tcPr>
             <w:tcW w:type="dxa" w:w="1980"/>
-            <w:shd w:fill="F1F5F9" w:color="auto" w:val="clear"/>
             <w:tcMar>
               <w:top w:type="dxa" w:w="60"/>
               <w:left w:type="dxa" w:w="100"/>
@@ -18385,14 +19094,13 @@
                 <w:sz w:val="18"/>
                 <w:szCs w:val="18"/>
               </w:rPr>
-              <w:t xml:space="preserve">rating</w:t>
+              <w:t xml:space="preserve">variantId</w:t>
             </w:r>
           </w:p>
         </w:tc>
         <w:tc>
           <w:tcPr>
             <w:tcW w:type="dxa" w:w="1420"/>
-            <w:shd w:fill="F1F5F9" w:color="auto" w:val="clear"/>
             <w:tcMar>
               <w:top w:type="dxa" w:w="60"/>
               <w:left w:type="dxa" w:w="100"/>
@@ -18419,7 +19127,6 @@
         <w:tc>
           <w:tcPr>
             <w:tcW w:type="dxa" w:w="2200"/>
-            <w:shd w:fill="F1F5F9" w:color="auto" w:val="clear"/>
             <w:tcMar>
               <w:top w:type="dxa" w:w="60"/>
               <w:left w:type="dxa" w:w="100"/>
@@ -18439,34 +19146,33 @@
                 <w:sz w:val="17"/>
                 <w:szCs w:val="17"/>
               </w:rPr>
-              <w:t xml:space="preserve">NOT NULL</w:t>
+              <w:t xml:space="preserve">FK → Variant.id, NULL, ON DELETE SET NULL</w:t>
             </w:r>
           </w:p>
         </w:tc>
         <w:tc>
           <w:tcPr>
             <w:tcW w:type="dxa" w:w="3426"/>
-            <w:shd w:fill="F1F5F9" w:color="auto" w:val="clear"/>
-            <w:tcMar>
-              <w:top w:type="dxa" w:w="60"/>
-              <w:left w:type="dxa" w:w="100"/>
-              <w:bottom w:type="dxa" w:w="60"/>
-              <w:right w:type="dxa" w:w="100"/>
-            </w:tcMar>
-          </w:tcPr>
-          <w:p>
-            <w:pPr>
-              <w:spacing w:after="0" w:before="0"/>
-            </w:pPr>
-            <w:r>
-              <w:rPr>
-                <w:rFonts w:ascii="Calibri" w:cs="Calibri" w:eastAsia="Calibri" w:hAnsi="Calibri"/>
-                <w:b w:val="false"/>
-                <w:bCs w:val="false"/>
-                <w:sz w:val="18"/>
-                <w:szCs w:val="18"/>
-              </w:rPr>
-              <w:t xml:space="preserve">Số sao 1–5</w:t>
+            <w:tcMar>
+              <w:top w:type="dxa" w:w="60"/>
+              <w:left w:type="dxa" w:w="100"/>
+              <w:bottom w:type="dxa" w:w="60"/>
+              <w:right w:type="dxa" w:w="100"/>
+            </w:tcMar>
+          </w:tcPr>
+          <w:p>
+            <w:pPr>
+              <w:spacing w:after="0" w:before="0"/>
+            </w:pPr>
+            <w:r>
+              <w:rPr>
+                <w:rFonts w:ascii="Calibri" w:cs="Calibri" w:eastAsia="Calibri" w:hAnsi="Calibri"/>
+                <w:b w:val="false"/>
+                <w:bCs w:val="false"/>
+                <w:sz w:val="18"/>
+                <w:szCs w:val="18"/>
+              </w:rPr>
+              <w:t xml:space="preserve">Biến thể khách đã mua (NULL = đánh giá chung)</w:t>
             </w:r>
           </w:p>
         </w:tc>
@@ -18475,6 +19181,7 @@
         <w:tc>
           <w:tcPr>
             <w:tcW w:type="dxa" w:w="1980"/>
+            <w:shd w:fill="FFFFFF" w:color="auto" w:val="clear"/>
             <w:tcMar>
               <w:top w:type="dxa" w:w="60"/>
               <w:left w:type="dxa" w:w="100"/>
@@ -18494,39 +19201,41 @@
                 <w:sz w:val="18"/>
                 <w:szCs w:val="18"/>
               </w:rPr>
-              <w:t xml:space="preserve">title</w:t>
+              <w:t xml:space="preserve">rating</w:t>
             </w:r>
           </w:p>
         </w:tc>
         <w:tc>
           <w:tcPr>
             <w:tcW w:type="dxa" w:w="1420"/>
-            <w:tcMar>
-              <w:top w:type="dxa" w:w="60"/>
-              <w:left w:type="dxa" w:w="100"/>
-              <w:bottom w:type="dxa" w:w="60"/>
-              <w:right w:type="dxa" w:w="100"/>
-            </w:tcMar>
-          </w:tcPr>
-          <w:p>
-            <w:pPr>
-              <w:spacing w:after="0" w:before="0"/>
-            </w:pPr>
-            <w:r>
-              <w:rPr>
-                <w:rFonts w:ascii="Calibri" w:cs="Calibri" w:eastAsia="Calibri" w:hAnsi="Calibri"/>
-                <w:b w:val="false"/>
-                <w:bCs w:val="false"/>
-                <w:sz w:val="18"/>
-                <w:szCs w:val="18"/>
-              </w:rPr>
-              <w:t xml:space="preserve">VARCHAR(191)</w:t>
+            <w:shd w:fill="FFFFFF" w:color="auto" w:val="clear"/>
+            <w:tcMar>
+              <w:top w:type="dxa" w:w="60"/>
+              <w:left w:type="dxa" w:w="100"/>
+              <w:bottom w:type="dxa" w:w="60"/>
+              <w:right w:type="dxa" w:w="100"/>
+            </w:tcMar>
+          </w:tcPr>
+          <w:p>
+            <w:pPr>
+              <w:spacing w:after="0" w:before="0"/>
+            </w:pPr>
+            <w:r>
+              <w:rPr>
+                <w:rFonts w:ascii="Calibri" w:cs="Calibri" w:eastAsia="Calibri" w:hAnsi="Calibri"/>
+                <w:b w:val="false"/>
+                <w:bCs w:val="false"/>
+                <w:sz w:val="18"/>
+                <w:szCs w:val="18"/>
+              </w:rPr>
+              <w:t xml:space="preserve">INT</w:t>
             </w:r>
           </w:p>
         </w:tc>
         <w:tc>
           <w:tcPr>
             <w:tcW w:type="dxa" w:w="2200"/>
+            <w:shd w:fill="FFFFFF" w:color="auto" w:val="clear"/>
             <w:tcMar>
               <w:top w:type="dxa" w:w="60"/>
               <w:left w:type="dxa" w:w="100"/>
@@ -18546,33 +19255,34 @@
                 <w:sz w:val="17"/>
                 <w:szCs w:val="17"/>
               </w:rPr>
-              <w:t xml:space="preserve">NULL</w:t>
+              <w:t xml:space="preserve">NOT NULL</w:t>
             </w:r>
           </w:p>
         </w:tc>
         <w:tc>
           <w:tcPr>
             <w:tcW w:type="dxa" w:w="3426"/>
-            <w:tcMar>
-              <w:top w:type="dxa" w:w="60"/>
-              <w:left w:type="dxa" w:w="100"/>
-              <w:bottom w:type="dxa" w:w="60"/>
-              <w:right w:type="dxa" w:w="100"/>
-            </w:tcMar>
-          </w:tcPr>
-          <w:p>
-            <w:pPr>
-              <w:spacing w:after="0" w:before="0"/>
-            </w:pPr>
-            <w:r>
-              <w:rPr>
-                <w:rFonts w:ascii="Calibri" w:cs="Calibri" w:eastAsia="Calibri" w:hAnsi="Calibri"/>
-                <w:b w:val="false"/>
-                <w:bCs w:val="false"/>
-                <w:sz w:val="18"/>
-                <w:szCs w:val="18"/>
-              </w:rPr>
-              <w:t xml:space="preserve">Tiêu đề đánh giá</w:t>
+            <w:shd w:fill="FFFFFF" w:color="auto" w:val="clear"/>
+            <w:tcMar>
+              <w:top w:type="dxa" w:w="60"/>
+              <w:left w:type="dxa" w:w="100"/>
+              <w:bottom w:type="dxa" w:w="60"/>
+              <w:right w:type="dxa" w:w="100"/>
+            </w:tcMar>
+          </w:tcPr>
+          <w:p>
+            <w:pPr>
+              <w:spacing w:after="0" w:before="0"/>
+            </w:pPr>
+            <w:r>
+              <w:rPr>
+                <w:rFonts w:ascii="Calibri" w:cs="Calibri" w:eastAsia="Calibri" w:hAnsi="Calibri"/>
+                <w:b w:val="false"/>
+                <w:bCs w:val="false"/>
+                <w:sz w:val="18"/>
+                <w:szCs w:val="18"/>
+              </w:rPr>
+              <w:t xml:space="preserve">Số sao 1–5</w:t>
             </w:r>
           </w:p>
         </w:tc>
@@ -18581,7 +19291,6 @@
         <w:tc>
           <w:tcPr>
             <w:tcW w:type="dxa" w:w="1980"/>
-            <w:shd w:fill="F1F5F9" w:color="auto" w:val="clear"/>
             <w:tcMar>
               <w:top w:type="dxa" w:w="60"/>
               <w:left w:type="dxa" w:w="100"/>
@@ -18601,41 +19310,39 @@
                 <w:sz w:val="18"/>
                 <w:szCs w:val="18"/>
               </w:rPr>
-              <w:t xml:space="preserve">content</w:t>
+              <w:t xml:space="preserve">title</w:t>
             </w:r>
           </w:p>
         </w:tc>
         <w:tc>
           <w:tcPr>
             <w:tcW w:type="dxa" w:w="1420"/>
-            <w:shd w:fill="F1F5F9" w:color="auto" w:val="clear"/>
-            <w:tcMar>
-              <w:top w:type="dxa" w:w="60"/>
-              <w:left w:type="dxa" w:w="100"/>
-              <w:bottom w:type="dxa" w:w="60"/>
-              <w:right w:type="dxa" w:w="100"/>
-            </w:tcMar>
-          </w:tcPr>
-          <w:p>
-            <w:pPr>
-              <w:spacing w:after="0" w:before="0"/>
-            </w:pPr>
-            <w:r>
-              <w:rPr>
-                <w:rFonts w:ascii="Calibri" w:cs="Calibri" w:eastAsia="Calibri" w:hAnsi="Calibri"/>
-                <w:b w:val="false"/>
-                <w:bCs w:val="false"/>
-                <w:sz w:val="18"/>
-                <w:szCs w:val="18"/>
-              </w:rPr>
-              <w:t xml:space="preserve">TEXT</w:t>
+            <w:tcMar>
+              <w:top w:type="dxa" w:w="60"/>
+              <w:left w:type="dxa" w:w="100"/>
+              <w:bottom w:type="dxa" w:w="60"/>
+              <w:right w:type="dxa" w:w="100"/>
+            </w:tcMar>
+          </w:tcPr>
+          <w:p>
+            <w:pPr>
+              <w:spacing w:after="0" w:before="0"/>
+            </w:pPr>
+            <w:r>
+              <w:rPr>
+                <w:rFonts w:ascii="Calibri" w:cs="Calibri" w:eastAsia="Calibri" w:hAnsi="Calibri"/>
+                <w:b w:val="false"/>
+                <w:bCs w:val="false"/>
+                <w:sz w:val="18"/>
+                <w:szCs w:val="18"/>
+              </w:rPr>
+              <w:t xml:space="preserve">VARCHAR(191)</w:t>
             </w:r>
           </w:p>
         </w:tc>
         <w:tc>
           <w:tcPr>
             <w:tcW w:type="dxa" w:w="2200"/>
-            <w:shd w:fill="F1F5F9" w:color="auto" w:val="clear"/>
             <w:tcMar>
               <w:top w:type="dxa" w:w="60"/>
               <w:left w:type="dxa" w:w="100"/>
@@ -18655,34 +19362,33 @@
                 <w:sz w:val="17"/>
                 <w:szCs w:val="17"/>
               </w:rPr>
-              <w:t xml:space="preserve">NOT NULL</w:t>
+              <w:t xml:space="preserve">NULL</w:t>
             </w:r>
           </w:p>
         </w:tc>
         <w:tc>
           <w:tcPr>
             <w:tcW w:type="dxa" w:w="3426"/>
-            <w:shd w:fill="F1F5F9" w:color="auto" w:val="clear"/>
-            <w:tcMar>
-              <w:top w:type="dxa" w:w="60"/>
-              <w:left w:type="dxa" w:w="100"/>
-              <w:bottom w:type="dxa" w:w="60"/>
-              <w:right w:type="dxa" w:w="100"/>
-            </w:tcMar>
-          </w:tcPr>
-          <w:p>
-            <w:pPr>
-              <w:spacing w:after="0" w:before="0"/>
-            </w:pPr>
-            <w:r>
-              <w:rPr>
-                <w:rFonts w:ascii="Calibri" w:cs="Calibri" w:eastAsia="Calibri" w:hAnsi="Calibri"/>
-                <w:b w:val="false"/>
-                <w:bCs w:val="false"/>
-                <w:sz w:val="18"/>
-                <w:szCs w:val="18"/>
-              </w:rPr>
-              <w:t xml:space="preserve">Nội dung</w:t>
+            <w:tcMar>
+              <w:top w:type="dxa" w:w="60"/>
+              <w:left w:type="dxa" w:w="100"/>
+              <w:bottom w:type="dxa" w:w="60"/>
+              <w:right w:type="dxa" w:w="100"/>
+            </w:tcMar>
+          </w:tcPr>
+          <w:p>
+            <w:pPr>
+              <w:spacing w:after="0" w:before="0"/>
+            </w:pPr>
+            <w:r>
+              <w:rPr>
+                <w:rFonts w:ascii="Calibri" w:cs="Calibri" w:eastAsia="Calibri" w:hAnsi="Calibri"/>
+                <w:b w:val="false"/>
+                <w:bCs w:val="false"/>
+                <w:sz w:val="18"/>
+                <w:szCs w:val="18"/>
+              </w:rPr>
+              <w:t xml:space="preserve">Tiêu đề đánh giá</w:t>
             </w:r>
           </w:p>
         </w:tc>
@@ -18691,6 +19397,7 @@
         <w:tc>
           <w:tcPr>
             <w:tcW w:type="dxa" w:w="1980"/>
+            <w:shd w:fill="FFFFFF" w:color="auto" w:val="clear"/>
             <w:tcMar>
               <w:top w:type="dxa" w:w="60"/>
               <w:left w:type="dxa" w:w="100"/>
@@ -18710,13 +19417,14 @@
                 <w:sz w:val="18"/>
                 <w:szCs w:val="18"/>
               </w:rPr>
-              <w:t xml:space="preserve">adminReply</w:t>
+              <w:t xml:space="preserve">content</w:t>
             </w:r>
           </w:p>
         </w:tc>
         <w:tc>
           <w:tcPr>
             <w:tcW w:type="dxa" w:w="1420"/>
+            <w:shd w:fill="FFFFFF" w:color="auto" w:val="clear"/>
             <w:tcMar>
               <w:top w:type="dxa" w:w="60"/>
               <w:left w:type="dxa" w:w="100"/>
@@ -18743,6 +19451,7 @@
         <w:tc>
           <w:tcPr>
             <w:tcW w:type="dxa" w:w="2200"/>
+            <w:shd w:fill="FFFFFF" w:color="auto" w:val="clear"/>
             <w:tcMar>
               <w:top w:type="dxa" w:w="60"/>
               <w:left w:type="dxa" w:w="100"/>
@@ -18762,33 +19471,34 @@
                 <w:sz w:val="17"/>
                 <w:szCs w:val="17"/>
               </w:rPr>
-              <w:t xml:space="preserve">NULL</w:t>
+              <w:t xml:space="preserve">NOT NULL</w:t>
             </w:r>
           </w:p>
         </w:tc>
         <w:tc>
           <w:tcPr>
             <w:tcW w:type="dxa" w:w="3426"/>
-            <w:tcMar>
-              <w:top w:type="dxa" w:w="60"/>
-              <w:left w:type="dxa" w:w="100"/>
-              <w:bottom w:type="dxa" w:w="60"/>
-              <w:right w:type="dxa" w:w="100"/>
-            </w:tcMar>
-          </w:tcPr>
-          <w:p>
-            <w:pPr>
-              <w:spacing w:after="0" w:before="0"/>
-            </w:pPr>
-            <w:r>
-              <w:rPr>
-                <w:rFonts w:ascii="Calibri" w:cs="Calibri" w:eastAsia="Calibri" w:hAnsi="Calibri"/>
-                <w:b w:val="false"/>
-                <w:bCs w:val="false"/>
-                <w:sz w:val="18"/>
-                <w:szCs w:val="18"/>
-              </w:rPr>
-              <w:t xml:space="preserve">Phản hồi của shop</w:t>
+            <w:shd w:fill="FFFFFF" w:color="auto" w:val="clear"/>
+            <w:tcMar>
+              <w:top w:type="dxa" w:w="60"/>
+              <w:left w:type="dxa" w:w="100"/>
+              <w:bottom w:type="dxa" w:w="60"/>
+              <w:right w:type="dxa" w:w="100"/>
+            </w:tcMar>
+          </w:tcPr>
+          <w:p>
+            <w:pPr>
+              <w:spacing w:after="0" w:before="0"/>
+            </w:pPr>
+            <w:r>
+              <w:rPr>
+                <w:rFonts w:ascii="Calibri" w:cs="Calibri" w:eastAsia="Calibri" w:hAnsi="Calibri"/>
+                <w:b w:val="false"/>
+                <w:bCs w:val="false"/>
+                <w:sz w:val="18"/>
+                <w:szCs w:val="18"/>
+              </w:rPr>
+              <w:t xml:space="preserve">Nội dung</w:t>
             </w:r>
           </w:p>
         </w:tc>
@@ -18797,7 +19507,6 @@
         <w:tc>
           <w:tcPr>
             <w:tcW w:type="dxa" w:w="1980"/>
-            <w:shd w:fill="F1F5F9" w:color="auto" w:val="clear"/>
             <w:tcMar>
               <w:top w:type="dxa" w:w="60"/>
               <w:left w:type="dxa" w:w="100"/>
@@ -18817,41 +19526,39 @@
                 <w:sz w:val="18"/>
                 <w:szCs w:val="18"/>
               </w:rPr>
-              <w:t xml:space="preserve">approved</w:t>
+              <w:t xml:space="preserve">adminReply</w:t>
             </w:r>
           </w:p>
         </w:tc>
         <w:tc>
           <w:tcPr>
             <w:tcW w:type="dxa" w:w="1420"/>
-            <w:shd w:fill="F1F5F9" w:color="auto" w:val="clear"/>
-            <w:tcMar>
-              <w:top w:type="dxa" w:w="60"/>
-              <w:left w:type="dxa" w:w="100"/>
-              <w:bottom w:type="dxa" w:w="60"/>
-              <w:right w:type="dxa" w:w="100"/>
-            </w:tcMar>
-          </w:tcPr>
-          <w:p>
-            <w:pPr>
-              <w:spacing w:after="0" w:before="0"/>
-            </w:pPr>
-            <w:r>
-              <w:rPr>
-                <w:rFonts w:ascii="Calibri" w:cs="Calibri" w:eastAsia="Calibri" w:hAnsi="Calibri"/>
-                <w:b w:val="false"/>
-                <w:bCs w:val="false"/>
-                <w:sz w:val="18"/>
-                <w:szCs w:val="18"/>
-              </w:rPr>
-              <w:t xml:space="preserve">TINYINT(1)</w:t>
+            <w:tcMar>
+              <w:top w:type="dxa" w:w="60"/>
+              <w:left w:type="dxa" w:w="100"/>
+              <w:bottom w:type="dxa" w:w="60"/>
+              <w:right w:type="dxa" w:w="100"/>
+            </w:tcMar>
+          </w:tcPr>
+          <w:p>
+            <w:pPr>
+              <w:spacing w:after="0" w:before="0"/>
+            </w:pPr>
+            <w:r>
+              <w:rPr>
+                <w:rFonts w:ascii="Calibri" w:cs="Calibri" w:eastAsia="Calibri" w:hAnsi="Calibri"/>
+                <w:b w:val="false"/>
+                <w:bCs w:val="false"/>
+                <w:sz w:val="18"/>
+                <w:szCs w:val="18"/>
+              </w:rPr>
+              <w:t xml:space="preserve">TEXT</w:t>
             </w:r>
           </w:p>
         </w:tc>
         <w:tc>
           <w:tcPr>
             <w:tcW w:type="dxa" w:w="2200"/>
-            <w:shd w:fill="F1F5F9" w:color="auto" w:val="clear"/>
             <w:tcMar>
               <w:top w:type="dxa" w:w="60"/>
               <w:left w:type="dxa" w:w="100"/>
@@ -18871,6 +19578,115 @@
                 <w:sz w:val="17"/>
                 <w:szCs w:val="17"/>
               </w:rPr>
+              <w:t xml:space="preserve">NULL</w:t>
+            </w:r>
+          </w:p>
+        </w:tc>
+        <w:tc>
+          <w:tcPr>
+            <w:tcW w:type="dxa" w:w="3426"/>
+            <w:tcMar>
+              <w:top w:type="dxa" w:w="60"/>
+              <w:left w:type="dxa" w:w="100"/>
+              <w:bottom w:type="dxa" w:w="60"/>
+              <w:right w:type="dxa" w:w="100"/>
+            </w:tcMar>
+          </w:tcPr>
+          <w:p>
+            <w:pPr>
+              <w:spacing w:after="0" w:before="0"/>
+            </w:pPr>
+            <w:r>
+              <w:rPr>
+                <w:rFonts w:ascii="Calibri" w:cs="Calibri" w:eastAsia="Calibri" w:hAnsi="Calibri"/>
+                <w:b w:val="false"/>
+                <w:bCs w:val="false"/>
+                <w:sz w:val="18"/>
+                <w:szCs w:val="18"/>
+              </w:rPr>
+              <w:t xml:space="preserve">Phản hồi của shop</w:t>
+            </w:r>
+          </w:p>
+        </w:tc>
+      </w:tr>
+      <w:tr>
+        <w:tc>
+          <w:tcPr>
+            <w:tcW w:type="dxa" w:w="1980"/>
+            <w:shd w:fill="FFFFFF" w:color="auto" w:val="clear"/>
+            <w:tcMar>
+              <w:top w:type="dxa" w:w="60"/>
+              <w:left w:type="dxa" w:w="100"/>
+              <w:bottom w:type="dxa" w:w="60"/>
+              <w:right w:type="dxa" w:w="100"/>
+            </w:tcMar>
+          </w:tcPr>
+          <w:p>
+            <w:pPr>
+              <w:spacing w:after="0" w:before="0"/>
+            </w:pPr>
+            <w:r>
+              <w:rPr>
+                <w:rFonts w:ascii="Consolas" w:cs="Consolas" w:eastAsia="Consolas" w:hAnsi="Consolas"/>
+                <w:b/>
+                <w:bCs/>
+                <w:sz w:val="18"/>
+                <w:szCs w:val="18"/>
+              </w:rPr>
+              <w:t xml:space="preserve">approved</w:t>
+            </w:r>
+          </w:p>
+        </w:tc>
+        <w:tc>
+          <w:tcPr>
+            <w:tcW w:type="dxa" w:w="1420"/>
+            <w:shd w:fill="FFFFFF" w:color="auto" w:val="clear"/>
+            <w:tcMar>
+              <w:top w:type="dxa" w:w="60"/>
+              <w:left w:type="dxa" w:w="100"/>
+              <w:bottom w:type="dxa" w:w="60"/>
+              <w:right w:type="dxa" w:w="100"/>
+            </w:tcMar>
+          </w:tcPr>
+          <w:p>
+            <w:pPr>
+              <w:spacing w:after="0" w:before="0"/>
+            </w:pPr>
+            <w:r>
+              <w:rPr>
+                <w:rFonts w:ascii="Calibri" w:cs="Calibri" w:eastAsia="Calibri" w:hAnsi="Calibri"/>
+                <w:b w:val="false"/>
+                <w:bCs w:val="false"/>
+                <w:sz w:val="18"/>
+                <w:szCs w:val="18"/>
+              </w:rPr>
+              <w:t xml:space="preserve">TINYINT(1)</w:t>
+            </w:r>
+          </w:p>
+        </w:tc>
+        <w:tc>
+          <w:tcPr>
+            <w:tcW w:type="dxa" w:w="2200"/>
+            <w:shd w:fill="FFFFFF" w:color="auto" w:val="clear"/>
+            <w:tcMar>
+              <w:top w:type="dxa" w:w="60"/>
+              <w:left w:type="dxa" w:w="100"/>
+              <w:bottom w:type="dxa" w:w="60"/>
+              <w:right w:type="dxa" w:w="100"/>
+            </w:tcMar>
+          </w:tcPr>
+          <w:p>
+            <w:pPr>
+              <w:spacing w:after="0" w:before="0"/>
+            </w:pPr>
+            <w:r>
+              <w:rPr>
+                <w:rFonts w:ascii="Calibri" w:cs="Calibri" w:eastAsia="Calibri" w:hAnsi="Calibri"/>
+                <w:b w:val="false"/>
+                <w:bCs w:val="false"/>
+                <w:sz w:val="17"/>
+                <w:szCs w:val="17"/>
+              </w:rPr>
               <w:t xml:space="preserve">NOT NULL, DEFAULT 0</w:t>
             </w:r>
           </w:p>
@@ -18878,7 +19694,7 @@
         <w:tc>
           <w:tcPr>
             <w:tcW w:type="dxa" w:w="3426"/>
-            <w:shd w:fill="F1F5F9" w:color="auto" w:val="clear"/>
+            <w:shd w:fill="FFFFFF" w:color="auto" w:val="clear"/>
             <w:tcMar>
               <w:top w:type="dxa" w:w="60"/>
               <w:left w:type="dxa" w:w="100"/>
@@ -19384,6 +20200,218 @@
                 <w:szCs w:val="18"/>
               </w:rPr>
               <w:t xml:space="preserve">Người nhận</w:t>
+            </w:r>
+          </w:p>
+        </w:tc>
+      </w:tr>
+      <w:tr>
+        <w:tc>
+          <w:tcPr>
+            <w:tcW w:type="dxa" w:w="1980"/>
+            <w:tcMar>
+              <w:top w:type="dxa" w:w="60"/>
+              <w:left w:type="dxa" w:w="100"/>
+              <w:bottom w:type="dxa" w:w="60"/>
+              <w:right w:type="dxa" w:w="100"/>
+            </w:tcMar>
+          </w:tcPr>
+          <w:p>
+            <w:pPr>
+              <w:spacing w:after="0" w:before="0"/>
+            </w:pPr>
+            <w:r>
+              <w:rPr>
+                <w:rFonts w:ascii="Consolas" w:cs="Consolas" w:eastAsia="Consolas" w:hAnsi="Consolas"/>
+                <w:b/>
+                <w:bCs/>
+                <w:sz w:val="18"/>
+                <w:szCs w:val="18"/>
+              </w:rPr>
+              <w:t xml:space="preserve">orderId</w:t>
+            </w:r>
+          </w:p>
+        </w:tc>
+        <w:tc>
+          <w:tcPr>
+            <w:tcW w:type="dxa" w:w="1420"/>
+            <w:tcMar>
+              <w:top w:type="dxa" w:w="60"/>
+              <w:left w:type="dxa" w:w="100"/>
+              <w:bottom w:type="dxa" w:w="60"/>
+              <w:right w:type="dxa" w:w="100"/>
+            </w:tcMar>
+          </w:tcPr>
+          <w:p>
+            <w:pPr>
+              <w:spacing w:after="0" w:before="0"/>
+            </w:pPr>
+            <w:r>
+              <w:rPr>
+                <w:rFonts w:ascii="Calibri" w:cs="Calibri" w:eastAsia="Calibri" w:hAnsi="Calibri"/>
+                <w:b w:val="false"/>
+                <w:bCs w:val="false"/>
+                <w:sz w:val="18"/>
+                <w:szCs w:val="18"/>
+              </w:rPr>
+              <w:t xml:space="preserve">VARCHAR(191)</w:t>
+            </w:r>
+          </w:p>
+        </w:tc>
+        <w:tc>
+          <w:tcPr>
+            <w:tcW w:type="dxa" w:w="2200"/>
+            <w:tcMar>
+              <w:top w:type="dxa" w:w="60"/>
+              <w:left w:type="dxa" w:w="100"/>
+              <w:bottom w:type="dxa" w:w="60"/>
+              <w:right w:type="dxa" w:w="100"/>
+            </w:tcMar>
+          </w:tcPr>
+          <w:p>
+            <w:pPr>
+              <w:spacing w:after="0" w:before="0"/>
+            </w:pPr>
+            <w:r>
+              <w:rPr>
+                <w:rFonts w:ascii="Calibri" w:cs="Calibri" w:eastAsia="Calibri" w:hAnsi="Calibri"/>
+                <w:b w:val="false"/>
+                <w:bCs w:val="false"/>
+                <w:sz w:val="17"/>
+                <w:szCs w:val="17"/>
+              </w:rPr>
+              <w:t xml:space="preserve">FK → Order.id, NULL, ON DELETE CASCADE</w:t>
+            </w:r>
+          </w:p>
+        </w:tc>
+        <w:tc>
+          <w:tcPr>
+            <w:tcW w:type="dxa" w:w="3426"/>
+            <w:tcMar>
+              <w:top w:type="dxa" w:w="60"/>
+              <w:left w:type="dxa" w:w="100"/>
+              <w:bottom w:type="dxa" w:w="60"/>
+              <w:right w:type="dxa" w:w="100"/>
+            </w:tcMar>
+          </w:tcPr>
+          <w:p>
+            <w:pPr>
+              <w:spacing w:after="0" w:before="0"/>
+            </w:pPr>
+            <w:r>
+              <w:rPr>
+                <w:rFonts w:ascii="Calibri" w:cs="Calibri" w:eastAsia="Calibri" w:hAnsi="Calibri"/>
+                <w:b w:val="false"/>
+                <w:bCs w:val="false"/>
+                <w:sz w:val="18"/>
+                <w:szCs w:val="18"/>
+              </w:rPr>
+              <w:t xml:space="preserve">Đơn hàng liên quan (thông báo loại order)</w:t>
+            </w:r>
+          </w:p>
+        </w:tc>
+      </w:tr>
+      <w:tr>
+        <w:tc>
+          <w:tcPr>
+            <w:tcW w:type="dxa" w:w="1980"/>
+            <w:tcMar>
+              <w:top w:type="dxa" w:w="60"/>
+              <w:left w:type="dxa" w:w="100"/>
+              <w:bottom w:type="dxa" w:w="60"/>
+              <w:right w:type="dxa" w:w="100"/>
+            </w:tcMar>
+          </w:tcPr>
+          <w:p>
+            <w:pPr>
+              <w:spacing w:after="0" w:before="0"/>
+            </w:pPr>
+            <w:r>
+              <w:rPr>
+                <w:rFonts w:ascii="Consolas" w:cs="Consolas" w:eastAsia="Consolas" w:hAnsi="Consolas"/>
+                <w:b/>
+                <w:bCs/>
+                <w:sz w:val="18"/>
+                <w:szCs w:val="18"/>
+              </w:rPr>
+              <w:t xml:space="preserve">voucherId</w:t>
+            </w:r>
+          </w:p>
+        </w:tc>
+        <w:tc>
+          <w:tcPr>
+            <w:tcW w:type="dxa" w:w="1420"/>
+            <w:tcMar>
+              <w:top w:type="dxa" w:w="60"/>
+              <w:left w:type="dxa" w:w="100"/>
+              <w:bottom w:type="dxa" w:w="60"/>
+              <w:right w:type="dxa" w:w="100"/>
+            </w:tcMar>
+          </w:tcPr>
+          <w:p>
+            <w:pPr>
+              <w:spacing w:after="0" w:before="0"/>
+            </w:pPr>
+            <w:r>
+              <w:rPr>
+                <w:rFonts w:ascii="Calibri" w:cs="Calibri" w:eastAsia="Calibri" w:hAnsi="Calibri"/>
+                <w:b w:val="false"/>
+                <w:bCs w:val="false"/>
+                <w:sz w:val="18"/>
+                <w:szCs w:val="18"/>
+              </w:rPr>
+              <w:t xml:space="preserve">INT</w:t>
+            </w:r>
+          </w:p>
+        </w:tc>
+        <w:tc>
+          <w:tcPr>
+            <w:tcW w:type="dxa" w:w="2200"/>
+            <w:tcMar>
+              <w:top w:type="dxa" w:w="60"/>
+              <w:left w:type="dxa" w:w="100"/>
+              <w:bottom w:type="dxa" w:w="60"/>
+              <w:right w:type="dxa" w:w="100"/>
+            </w:tcMar>
+          </w:tcPr>
+          <w:p>
+            <w:pPr>
+              <w:spacing w:after="0" w:before="0"/>
+            </w:pPr>
+            <w:r>
+              <w:rPr>
+                <w:rFonts w:ascii="Calibri" w:cs="Calibri" w:eastAsia="Calibri" w:hAnsi="Calibri"/>
+                <w:b w:val="false"/>
+                <w:bCs w:val="false"/>
+                <w:sz w:val="17"/>
+                <w:szCs w:val="17"/>
+              </w:rPr>
+              <w:t xml:space="preserve">FK → Voucher.id, NULL, ON DELETE SET NULL</w:t>
+            </w:r>
+          </w:p>
+        </w:tc>
+        <w:tc>
+          <w:tcPr>
+            <w:tcW w:type="dxa" w:w="3426"/>
+            <w:tcMar>
+              <w:top w:type="dxa" w:w="60"/>
+              <w:left w:type="dxa" w:w="100"/>
+              <w:bottom w:type="dxa" w:w="60"/>
+              <w:right w:type="dxa" w:w="100"/>
+            </w:tcMar>
+          </w:tcPr>
+          <w:p>
+            <w:pPr>
+              <w:spacing w:after="0" w:before="0"/>
+            </w:pPr>
+            <w:r>
+              <w:rPr>
+                <w:rFonts w:ascii="Calibri" w:cs="Calibri" w:eastAsia="Calibri" w:hAnsi="Calibri"/>
+                <w:b w:val="false"/>
+                <w:bCs w:val="false"/>
+                <w:sz w:val="18"/>
+                <w:szCs w:val="18"/>
+              </w:rPr>
+              <w:t xml:space="preserve">Mã giảm giá được quảng bá (thông báo loại promo)</w:t>
             </w:r>
           </w:p>
         </w:tc>

</xml_diff>